<commit_message>
Day 4 Homework Done
</commit_message>
<xml_diff>
--- a/Codes and Projects/Servicenow development/Day 4 Homework/Day 4 Homework.docx
+++ b/Codes and Projects/Servicenow development/Day 4 Homework/Day 4 Homework.docx
@@ -15,54 +15,425 @@
         <w:t>Day 4 Homework</w:t>
       </w:r>
     </w:p>
-    <w:sdt>
-      <w:sdtPr>
-        <w:alias w:val="Enter heading 2:"/>
-        <w:tag w:val="Enter heading 2:"/>
-        <w:id w:val="1730723226"/>
-        <w:placeholder>
-          <w:docPart w:val="FC130C55135447B280635A6764D0D0B8"/>
-        </w:placeholder>
-        <w:temporary/>
-        <w:showingPlcHdr/>
-        <w15:appearance w15:val="hidden"/>
-      </w:sdtPr>
-      <w:sdtContent>
-        <w:p>
-          <w:pPr>
-            <w:pStyle w:val="Heading2"/>
-          </w:pPr>
-          <w:r>
-            <w:t>Heading 2</w:t>
-          </w:r>
-        </w:p>
-      </w:sdtContent>
-    </w:sdt>
     <w:p>
       <w:pPr>
+        <w:pStyle w:val="Heading2"/>
+      </w:pPr>
+      <w:r>
+        <w:t>UI Policy screenshot</w:t>
+      </w:r>
+    </w:p>
+    <w:p>
+      <w:pPr>
         <w:pStyle w:val="BlockText"/>
       </w:pPr>
-      <w:sdt>
-        <w:sdtPr>
-          <w:alias w:val="Enter block text:"/>
-          <w:tag w:val="Enter block text:"/>
-          <w:id w:val="851456089"/>
-          <w:placeholder>
-            <w:docPart w:val="CF2367E2F3EA4EC5AB99DFFBD344D016"/>
-          </w:placeholder>
-          <w:temporary/>
-          <w:showingPlcHdr/>
-          <w15:appearance w15:val="hidden"/>
-        </w:sdtPr>
-        <w:sdtContent>
-          <w:r>
-            <w:t>To get started right away, just tap any placeholder text (such as this) and start typing.</w:t>
-          </w:r>
-        </w:sdtContent>
-      </w:sdt>
+      <w:r>
+        <w:t>Created Onload form policy that makes Admitted date Not visible and not mandatory</w:t>
+      </w:r>
+      <w:r>
+        <w:br/>
+      </w:r>
+      <w:r>
+        <w:drawing>
+          <wp:inline distT="0" distB="0" distL="0" distR="0" wp14:anchorId="5A5D29F9" wp14:editId="6915CDAB">
+            <wp:extent cx="6400800" cy="1149985"/>
+            <wp:effectExtent l="0" t="0" r="0" b="0"/>
+            <wp:docPr id="911740253" name="Picture 1"/>
+            <wp:cNvGraphicFramePr>
+              <a:graphicFrameLocks xmlns:a="http://schemas.openxmlformats.org/drawingml/2006/main" noChangeAspect="1"/>
+            </wp:cNvGraphicFramePr>
+            <a:graphic xmlns:a="http://schemas.openxmlformats.org/drawingml/2006/main">
+              <a:graphicData uri="http://schemas.openxmlformats.org/drawingml/2006/picture">
+                <pic:pic xmlns:pic="http://schemas.openxmlformats.org/drawingml/2006/picture">
+                  <pic:nvPicPr>
+                    <pic:cNvPr id="911740253" name=""/>
+                    <pic:cNvPicPr/>
+                  </pic:nvPicPr>
+                  <pic:blipFill>
+                    <a:blip r:embed="rId7"/>
+                    <a:stretch>
+                      <a:fillRect/>
+                    </a:stretch>
+                  </pic:blipFill>
+                  <pic:spPr>
+                    <a:xfrm>
+                      <a:off x="0" y="0"/>
+                      <a:ext cx="6400800" cy="1149985"/>
+                    </a:xfrm>
+                    <a:prstGeom prst="rect">
+                      <a:avLst/>
+                    </a:prstGeom>
+                  </pic:spPr>
+                </pic:pic>
+              </a:graphicData>
+            </a:graphic>
+          </wp:inline>
+        </w:drawing>
+      </w:r>
+      <w:r>
+        <w:br/>
+        <w:t xml:space="preserve">Then created another UI policy that have a specific condition when </w:t>
+      </w:r>
+      <w:r>
+        <w:br/>
+        <w:t>patient type= PID then Admitted date must be visible and mandatory</w:t>
+      </w:r>
+      <w:r>
+        <w:br/>
+      </w:r>
+      <w:r>
+        <w:drawing>
+          <wp:inline distT="0" distB="0" distL="0" distR="0" wp14:anchorId="28348104" wp14:editId="6EE792E0">
+            <wp:extent cx="6400800" cy="1010285"/>
+            <wp:effectExtent l="0" t="0" r="0" b="0"/>
+            <wp:docPr id="683257211" name="Picture 1"/>
+            <wp:cNvGraphicFramePr>
+              <a:graphicFrameLocks xmlns:a="http://schemas.openxmlformats.org/drawingml/2006/main" noChangeAspect="1"/>
+            </wp:cNvGraphicFramePr>
+            <a:graphic xmlns:a="http://schemas.openxmlformats.org/drawingml/2006/main">
+              <a:graphicData uri="http://schemas.openxmlformats.org/drawingml/2006/picture">
+                <pic:pic xmlns:pic="http://schemas.openxmlformats.org/drawingml/2006/picture">
+                  <pic:nvPicPr>
+                    <pic:cNvPr id="683257211" name=""/>
+                    <pic:cNvPicPr/>
+                  </pic:nvPicPr>
+                  <pic:blipFill>
+                    <a:blip r:embed="rId8"/>
+                    <a:stretch>
+                      <a:fillRect/>
+                    </a:stretch>
+                  </pic:blipFill>
+                  <pic:spPr>
+                    <a:xfrm>
+                      <a:off x="0" y="0"/>
+                      <a:ext cx="6400800" cy="1010285"/>
+                    </a:xfrm>
+                    <a:prstGeom prst="rect">
+                      <a:avLst/>
+                    </a:prstGeom>
+                  </pic:spPr>
+                </pic:pic>
+              </a:graphicData>
+            </a:graphic>
+          </wp:inline>
+        </w:drawing>
+      </w:r>
+      <w:r>
+        <w:br/>
+        <w:t>Both policies:</w:t>
+      </w:r>
+      <w:r>
+        <w:br/>
+      </w:r>
+      <w:r>
+        <w:drawing>
+          <wp:inline distT="0" distB="0" distL="0" distR="0" wp14:anchorId="27F23ED2" wp14:editId="42EC74DE">
+            <wp:extent cx="6400800" cy="1319530"/>
+            <wp:effectExtent l="0" t="0" r="0" b="0"/>
+            <wp:docPr id="1192501685" name="Picture 1"/>
+            <wp:cNvGraphicFramePr>
+              <a:graphicFrameLocks xmlns:a="http://schemas.openxmlformats.org/drawingml/2006/main" noChangeAspect="1"/>
+            </wp:cNvGraphicFramePr>
+            <a:graphic xmlns:a="http://schemas.openxmlformats.org/drawingml/2006/main">
+              <a:graphicData uri="http://schemas.openxmlformats.org/drawingml/2006/picture">
+                <pic:pic xmlns:pic="http://schemas.openxmlformats.org/drawingml/2006/picture">
+                  <pic:nvPicPr>
+                    <pic:cNvPr id="1192501685" name=""/>
+                    <pic:cNvPicPr/>
+                  </pic:nvPicPr>
+                  <pic:blipFill>
+                    <a:blip r:embed="rId9"/>
+                    <a:stretch>
+                      <a:fillRect/>
+                    </a:stretch>
+                  </pic:blipFill>
+                  <pic:spPr>
+                    <a:xfrm>
+                      <a:off x="0" y="0"/>
+                      <a:ext cx="6400800" cy="1319530"/>
+                    </a:xfrm>
+                    <a:prstGeom prst="rect">
+                      <a:avLst/>
+                    </a:prstGeom>
+                  </pic:spPr>
+                </pic:pic>
+              </a:graphicData>
+            </a:graphic>
+          </wp:inline>
+        </w:drawing>
+      </w:r>
+    </w:p>
+    <w:p>
+      <w:pPr>
+        <w:pStyle w:val="Heading2"/>
+      </w:pPr>
+      <w:r>
+        <w:lastRenderedPageBreak/>
+        <w:t>Data</w:t>
+      </w:r>
+      <w:r>
+        <w:t xml:space="preserve"> Policy screenshot</w:t>
+      </w:r>
+    </w:p>
+    <w:p>
+      <w:pPr>
+        <w:pStyle w:val="BlockText"/>
+      </w:pPr>
+      <w:r>
+        <w:t>Data policy upon phone number field that it should be mandatory</w:t>
+      </w:r>
+      <w:r>
+        <w:br/>
+      </w:r>
+      <w:r>
+        <w:drawing>
+          <wp:inline distT="0" distB="0" distL="0" distR="0" wp14:anchorId="2078D270" wp14:editId="69171E22">
+            <wp:extent cx="6400800" cy="3056890"/>
+            <wp:effectExtent l="0" t="0" r="0" b="0"/>
+            <wp:docPr id="1924644236" name="Picture 1"/>
+            <wp:cNvGraphicFramePr>
+              <a:graphicFrameLocks xmlns:a="http://schemas.openxmlformats.org/drawingml/2006/main" noChangeAspect="1"/>
+            </wp:cNvGraphicFramePr>
+            <a:graphic xmlns:a="http://schemas.openxmlformats.org/drawingml/2006/main">
+              <a:graphicData uri="http://schemas.openxmlformats.org/drawingml/2006/picture">
+                <pic:pic xmlns:pic="http://schemas.openxmlformats.org/drawingml/2006/picture">
+                  <pic:nvPicPr>
+                    <pic:cNvPr id="1924644236" name=""/>
+                    <pic:cNvPicPr/>
+                  </pic:nvPicPr>
+                  <pic:blipFill>
+                    <a:blip r:embed="rId10"/>
+                    <a:stretch>
+                      <a:fillRect/>
+                    </a:stretch>
+                  </pic:blipFill>
+                  <pic:spPr>
+                    <a:xfrm>
+                      <a:off x="0" y="0"/>
+                      <a:ext cx="6400800" cy="3056890"/>
+                    </a:xfrm>
+                    <a:prstGeom prst="rect">
+                      <a:avLst/>
+                    </a:prstGeom>
+                  </pic:spPr>
+                </pic:pic>
+              </a:graphicData>
+            </a:graphic>
+          </wp:inline>
+        </w:drawing>
+      </w:r>
+    </w:p>
+    <w:p>
+      <w:pPr>
+        <w:pStyle w:val="Heading2"/>
+      </w:pPr>
+      <w:r>
+        <w:lastRenderedPageBreak/>
+        <w:t>Notification</w:t>
+      </w:r>
+      <w:r>
+        <w:t xml:space="preserve"> screenshot</w:t>
+      </w:r>
+    </w:p>
+    <w:p>
+      <w:pPr>
+        <w:pStyle w:val="BlockText"/>
+      </w:pPr>
+      <w:r>
+        <w:t xml:space="preserve">Created a notification in a doctor table </w:t>
+      </w:r>
+      <w:r>
+        <w:br/>
+      </w:r>
+      <w:r>
+        <w:drawing>
+          <wp:inline distT="0" distB="0" distL="0" distR="0" wp14:anchorId="2B11B570" wp14:editId="795A614D">
+            <wp:extent cx="6400800" cy="913765"/>
+            <wp:effectExtent l="0" t="0" r="0" b="635"/>
+            <wp:docPr id="1045585677" name="Picture 1"/>
+            <wp:cNvGraphicFramePr>
+              <a:graphicFrameLocks xmlns:a="http://schemas.openxmlformats.org/drawingml/2006/main" noChangeAspect="1"/>
+            </wp:cNvGraphicFramePr>
+            <a:graphic xmlns:a="http://schemas.openxmlformats.org/drawingml/2006/main">
+              <a:graphicData uri="http://schemas.openxmlformats.org/drawingml/2006/picture">
+                <pic:pic xmlns:pic="http://schemas.openxmlformats.org/drawingml/2006/picture">
+                  <pic:nvPicPr>
+                    <pic:cNvPr id="1045585677" name=""/>
+                    <pic:cNvPicPr/>
+                  </pic:nvPicPr>
+                  <pic:blipFill>
+                    <a:blip r:embed="rId11"/>
+                    <a:stretch>
+                      <a:fillRect/>
+                    </a:stretch>
+                  </pic:blipFill>
+                  <pic:spPr>
+                    <a:xfrm>
+                      <a:off x="0" y="0"/>
+                      <a:ext cx="6400800" cy="913765"/>
+                    </a:xfrm>
+                    <a:prstGeom prst="rect">
+                      <a:avLst/>
+                    </a:prstGeom>
+                  </pic:spPr>
+                </pic:pic>
+              </a:graphicData>
+            </a:graphic>
+          </wp:inline>
+        </w:drawing>
+      </w:r>
+      <w:r>
+        <w:br/>
+      </w:r>
+      <w:r>
+        <w:drawing>
+          <wp:inline distT="0" distB="0" distL="0" distR="0" wp14:anchorId="6C60966D" wp14:editId="3B706C10">
+            <wp:extent cx="6082748" cy="5886024"/>
+            <wp:effectExtent l="0" t="0" r="0" b="635"/>
+            <wp:docPr id="604125665" name="Picture 1"/>
+            <wp:cNvGraphicFramePr>
+              <a:graphicFrameLocks xmlns:a="http://schemas.openxmlformats.org/drawingml/2006/main" noChangeAspect="1"/>
+            </wp:cNvGraphicFramePr>
+            <a:graphic xmlns:a="http://schemas.openxmlformats.org/drawingml/2006/main">
+              <a:graphicData uri="http://schemas.openxmlformats.org/drawingml/2006/picture">
+                <pic:pic xmlns:pic="http://schemas.openxmlformats.org/drawingml/2006/picture">
+                  <pic:nvPicPr>
+                    <pic:cNvPr id="604125665" name=""/>
+                    <pic:cNvPicPr/>
+                  </pic:nvPicPr>
+                  <pic:blipFill>
+                    <a:blip r:embed="rId12"/>
+                    <a:stretch>
+                      <a:fillRect/>
+                    </a:stretch>
+                  </pic:blipFill>
+                  <pic:spPr>
+                    <a:xfrm>
+                      <a:off x="0" y="0"/>
+                      <a:ext cx="6133643" cy="5935273"/>
+                    </a:xfrm>
+                    <a:prstGeom prst="rect">
+                      <a:avLst/>
+                    </a:prstGeom>
+                  </pic:spPr>
+                </pic:pic>
+              </a:graphicData>
+            </a:graphic>
+          </wp:inline>
+        </w:drawing>
+      </w:r>
+    </w:p>
+    <w:p>
+      <w:pPr>
+        <w:pStyle w:val="Heading2"/>
+      </w:pPr>
+      <w:r>
+        <w:lastRenderedPageBreak/>
+        <w:t>Import Result</w:t>
+      </w:r>
+    </w:p>
+    <w:p>
+      <w:pPr>
+        <w:pStyle w:val="BlockText"/>
+      </w:pPr>
+      <w:r>
+        <w:t>Created a doctor import set for doctor table that have 10 records and uploaded it on a dummy table called doctor details import</w:t>
+      </w:r>
+      <w:r>
+        <w:br/>
+      </w:r>
+      <w:r>
+        <w:drawing>
+          <wp:inline distT="0" distB="0" distL="0" distR="0" wp14:anchorId="181F1923" wp14:editId="3AD987DF">
+            <wp:extent cx="6400800" cy="1490980"/>
+            <wp:effectExtent l="0" t="0" r="0" b="0"/>
+            <wp:docPr id="2006462950" name="Picture 1"/>
+            <wp:cNvGraphicFramePr>
+              <a:graphicFrameLocks xmlns:a="http://schemas.openxmlformats.org/drawingml/2006/main" noChangeAspect="1"/>
+            </wp:cNvGraphicFramePr>
+            <a:graphic xmlns:a="http://schemas.openxmlformats.org/drawingml/2006/main">
+              <a:graphicData uri="http://schemas.openxmlformats.org/drawingml/2006/picture">
+                <pic:pic xmlns:pic="http://schemas.openxmlformats.org/drawingml/2006/picture">
+                  <pic:nvPicPr>
+                    <pic:cNvPr id="2006462950" name=""/>
+                    <pic:cNvPicPr/>
+                  </pic:nvPicPr>
+                  <pic:blipFill>
+                    <a:blip r:embed="rId13"/>
+                    <a:stretch>
+                      <a:fillRect/>
+                    </a:stretch>
+                  </pic:blipFill>
+                  <pic:spPr>
+                    <a:xfrm>
+                      <a:off x="0" y="0"/>
+                      <a:ext cx="6400800" cy="1490980"/>
+                    </a:xfrm>
+                    <a:prstGeom prst="rect">
+                      <a:avLst/>
+                    </a:prstGeom>
+                  </pic:spPr>
+                </pic:pic>
+              </a:graphicData>
+            </a:graphic>
+          </wp:inline>
+        </w:drawing>
+      </w:r>
+      <w:r>
+        <w:br/>
+        <w:t>Then created an import map between the two tables(doctor and doctor details import) then used the feature to map matching fields</w:t>
+      </w:r>
+      <w:r>
+        <w:br/>
+      </w:r>
+      <w:r>
+        <w:drawing>
+          <wp:inline distT="0" distB="0" distL="0" distR="0" wp14:anchorId="1D30F67F" wp14:editId="0A6AA0E3">
+            <wp:extent cx="6400800" cy="3497580"/>
+            <wp:effectExtent l="0" t="0" r="0" b="7620"/>
+            <wp:docPr id="11178228" name="Picture 1"/>
+            <wp:cNvGraphicFramePr>
+              <a:graphicFrameLocks xmlns:a="http://schemas.openxmlformats.org/drawingml/2006/main" noChangeAspect="1"/>
+            </wp:cNvGraphicFramePr>
+            <a:graphic xmlns:a="http://schemas.openxmlformats.org/drawingml/2006/main">
+              <a:graphicData uri="http://schemas.openxmlformats.org/drawingml/2006/picture">
+                <pic:pic xmlns:pic="http://schemas.openxmlformats.org/drawingml/2006/picture">
+                  <pic:nvPicPr>
+                    <pic:cNvPr id="11178228" name=""/>
+                    <pic:cNvPicPr/>
+                  </pic:nvPicPr>
+                  <pic:blipFill>
+                    <a:blip r:embed="rId14"/>
+                    <a:stretch>
+                      <a:fillRect/>
+                    </a:stretch>
+                  </pic:blipFill>
+                  <pic:spPr>
+                    <a:xfrm>
+                      <a:off x="0" y="0"/>
+                      <a:ext cx="6400800" cy="3497580"/>
+                    </a:xfrm>
+                    <a:prstGeom prst="rect">
+                      <a:avLst/>
+                    </a:prstGeom>
+                  </pic:spPr>
+                </pic:pic>
+              </a:graphicData>
+            </a:graphic>
+          </wp:inline>
+        </w:drawing>
+      </w:r>
+      <w:r>
+        <w:br/>
+      </w:r>
+    </w:p>
+    <w:p>
+      <w:pPr>
+        <w:pStyle w:val="BlockText"/>
+      </w:pPr>
     </w:p>
     <w:sectPr>
-      <w:footerReference w:type="default" r:id="rId7"/>
+      <w:footerReference w:type="default" r:id="rId15"/>
       <w:pgSz w:w="12240" w:h="15840"/>
       <w:pgMar w:top="1440" w:right="1080" w:bottom="1829" w:left="1080" w:header="720" w:footer="792" w:gutter="0"/>
       <w:cols w:space="720"/>
@@ -2696,823 +3067,6 @@
 </w:styles>
 </file>
 
-<file path=word/glossary/document.xml><?xml version="1.0" encoding="utf-8"?>
-<w:glossaryDocument xmlns:wpc="http://schemas.microsoft.com/office/word/2010/wordprocessingCanvas" xmlns:cx="http://schemas.microsoft.com/office/drawing/2014/chartex" xmlns:cx1="http://schemas.microsoft.com/office/drawing/2015/9/8/chartex" xmlns:cx2="http://schemas.microsoft.com/office/drawing/2015/10/21/chartex" xmlns:cx3="http://schemas.microsoft.com/office/drawing/2016/5/9/chartex" xmlns:cx4="http://schemas.microsoft.com/office/drawing/2016/5/10/chartex" xmlns:cx5="http://schemas.microsoft.com/office/drawing/2016/5/11/chartex" xmlns:cx6="http://schemas.microsoft.com/office/drawing/2016/5/12/chartex" xmlns:cx7="http://schemas.microsoft.com/office/drawing/2016/5/13/chartex" xmlns:cx8="http://schemas.microsoft.com/office/drawing/2016/5/14/chartex" xmlns:mc="http://schemas.openxmlformats.org/markup-compatibility/2006" xmlns:aink="http://schemas.microsoft.com/office/drawing/2016/ink" xmlns:am3d="http://schemas.microsoft.com/office/drawing/2017/model3d" xmlns:o="urn:schemas-microsoft-com:office:office" xmlns:oel="http://schemas.microsoft.com/office/2019/extlst" xmlns:r="http://schemas.openxmlformats.org/officeDocument/2006/relationships" xmlns:m="http://schemas.openxmlformats.org/officeDocument/2006/math" xmlns:v="urn:schemas-microsoft-com:vml" xmlns:wp14="http://schemas.microsoft.com/office/word/2010/wordprocessingDrawing" xmlns:wp="http://schemas.openxmlformats.org/drawingml/2006/wordprocessingDrawing" xmlns:w10="urn:schemas-microsoft-com:office:word" xmlns:w="http://schemas.openxmlformats.org/wordprocessingml/2006/main" xmlns:w14="http://schemas.microsoft.com/office/word/2010/wordml" xmlns:w15="http://schemas.microsoft.com/office/word/2012/wordml" xmlns:w16cex="http://schemas.microsoft.com/office/word/2018/wordml/cex" xmlns:w16cid="http://schemas.microsoft.com/office/word/2016/wordml/cid" xmlns:w16="http://schemas.microsoft.com/office/word/2018/wordml" xmlns:w16du="http://schemas.microsoft.com/office/word/2023/wordml/word16du" xmlns:w16sdtdh="http://schemas.microsoft.com/office/word/2020/wordml/sdtdatahash" xmlns:w16sdtfl="http://schemas.microsoft.com/office/word/2024/wordml/sdtformatlock" xmlns:w16se="http://schemas.microsoft.com/office/word/2015/wordml/symex" xmlns:wpg="http://schemas.microsoft.com/office/word/2010/wordprocessingGroup" xmlns:wpi="http://schemas.microsoft.com/office/word/2010/wordprocessingInk" xmlns:wne="http://schemas.microsoft.com/office/word/2006/wordml" xmlns:wps="http://schemas.microsoft.com/office/word/2010/wordprocessingShape" mc:Ignorable="w14 w15 w16se w16cid w16 w16cex w16sdtdh w16sdtfl w16du wp14">
-  <w:docParts>
-    <w:docPart>
-      <w:docPartPr>
-        <w:name w:val="FC130C55135447B280635A6764D0D0B8"/>
-        <w:category>
-          <w:name w:val="General"/>
-          <w:gallery w:val="placeholder"/>
-        </w:category>
-        <w:types>
-          <w:type w:val="bbPlcHdr"/>
-        </w:types>
-        <w:behaviors>
-          <w:behavior w:val="content"/>
-        </w:behaviors>
-        <w:guid w:val="{16EEBA86-4DB7-4FFB-8792-4D76AE741F58}"/>
-      </w:docPartPr>
-      <w:docPartBody>
-        <w:p>
-          <w:pPr>
-            <w:pStyle w:val="FC130C55135447B280635A6764D0D0B8"/>
-          </w:pPr>
-          <w:r>
-            <w:t>Heading 2</w:t>
-          </w:r>
-        </w:p>
-      </w:docPartBody>
-    </w:docPart>
-    <w:docPart>
-      <w:docPartPr>
-        <w:name w:val="CF2367E2F3EA4EC5AB99DFFBD344D016"/>
-        <w:category>
-          <w:name w:val="General"/>
-          <w:gallery w:val="placeholder"/>
-        </w:category>
-        <w:types>
-          <w:type w:val="bbPlcHdr"/>
-        </w:types>
-        <w:behaviors>
-          <w:behavior w:val="content"/>
-        </w:behaviors>
-        <w:guid w:val="{529D3325-5845-4EEA-80BE-3EFD4164C264}"/>
-      </w:docPartPr>
-      <w:docPartBody>
-        <w:p>
-          <w:pPr>
-            <w:pStyle w:val="CF2367E2F3EA4EC5AB99DFFBD344D016"/>
-          </w:pPr>
-          <w:r>
-            <w:t>To get started right away, just tap any placeholder text (such as this) and start typing.</w:t>
-          </w:r>
-        </w:p>
-      </w:docPartBody>
-    </w:docPart>
-  </w:docParts>
-</w:glossaryDocument>
-</file>
-
-<file path=word/glossary/fontTable.xml><?xml version="1.0" encoding="utf-8"?>
-<w:fonts xmlns:mc="http://schemas.openxmlformats.org/markup-compatibility/2006" xmlns:r="http://schemas.openxmlformats.org/officeDocument/2006/relationships" xmlns:w="http://schemas.openxmlformats.org/wordprocessingml/2006/main" xmlns:w14="http://schemas.microsoft.com/office/word/2010/wordml" xmlns:w15="http://schemas.microsoft.com/office/word/2012/wordml" xmlns:w16cex="http://schemas.microsoft.com/office/word/2018/wordml/cex" xmlns:w16cid="http://schemas.microsoft.com/office/word/2016/wordml/cid" xmlns:w16="http://schemas.microsoft.com/office/word/2018/wordml" xmlns:w16du="http://schemas.microsoft.com/office/word/2023/wordml/word16du" xmlns:w16sdtdh="http://schemas.microsoft.com/office/word/2020/wordml/sdtdatahash" xmlns:w16sdtfl="http://schemas.microsoft.com/office/word/2024/wordml/sdtformatlock" xmlns:w16se="http://schemas.microsoft.com/office/word/2015/wordml/symex" mc:Ignorable="w14 w15 w16se w16cid w16 w16cex w16sdtdh w16sdtfl w16du">
-  <w:font w:name="Times New Roman">
-    <w:panose1 w:val="02020603050405020304"/>
-    <w:charset w:val="00"/>
-    <w:family w:val="roman"/>
-    <w:pitch w:val="variable"/>
-    <w:sig w:usb0="E0002EFF" w:usb1="C000785B" w:usb2="00000009" w:usb3="00000000" w:csb0="000001FF" w:csb1="00000000"/>
-  </w:font>
-  <w:font w:name="Symbol">
-    <w:panose1 w:val="05050102010706020507"/>
-    <w:charset w:val="02"/>
-    <w:family w:val="roman"/>
-    <w:pitch w:val="variable"/>
-    <w:sig w:usb0="00000000" w:usb1="10000000" w:usb2="00000000" w:usb3="00000000" w:csb0="80000000" w:csb1="00000000"/>
-  </w:font>
-  <w:font w:name="Courier New">
-    <w:panose1 w:val="02070309020205020404"/>
-    <w:charset w:val="00"/>
-    <w:family w:val="modern"/>
-    <w:pitch w:val="fixed"/>
-    <w:sig w:usb0="E0002EFF" w:usb1="C0007843" w:usb2="00000009" w:usb3="00000000" w:csb0="000001FF" w:csb1="00000000"/>
-  </w:font>
-  <w:font w:name="Wingdings">
-    <w:panose1 w:val="05000000000000000000"/>
-    <w:charset w:val="02"/>
-    <w:family w:val="auto"/>
-    <w:pitch w:val="variable"/>
-    <w:sig w:usb0="00000000" w:usb1="10000000" w:usb2="00000000" w:usb3="00000000" w:csb0="80000000" w:csb1="00000000"/>
-  </w:font>
-  <w:font w:name="Tahoma">
-    <w:panose1 w:val="020B0604030504040204"/>
-    <w:charset w:val="00"/>
-    <w:family w:val="swiss"/>
-    <w:pitch w:val="variable"/>
-    <w:sig w:usb0="E1002EFF" w:usb1="C000605B" w:usb2="00000029" w:usb3="00000000" w:csb0="000101FF" w:csb1="00000000"/>
-  </w:font>
-  <w:font w:name="Arial">
-    <w:panose1 w:val="020B0604020202020204"/>
-    <w:charset w:val="00"/>
-    <w:family w:val="swiss"/>
-    <w:pitch w:val="variable"/>
-    <w:sig w:usb0="E0002EFF" w:usb1="C000785B" w:usb2="00000009" w:usb3="00000000" w:csb0="000001FF" w:csb1="00000000"/>
-  </w:font>
-  <w:font w:name="Segoe UI">
-    <w:panose1 w:val="020B0502040204020203"/>
-    <w:charset w:val="00"/>
-    <w:family w:val="swiss"/>
-    <w:pitch w:val="variable"/>
-    <w:sig w:usb0="E4002EFF" w:usb1="C000E47F" w:usb2="00000009" w:usb3="00000000" w:csb0="000001FF" w:csb1="00000000"/>
-  </w:font>
-  <w:font w:name="Consolas">
-    <w:panose1 w:val="020B0609020204030204"/>
-    <w:charset w:val="00"/>
-    <w:family w:val="modern"/>
-    <w:pitch w:val="fixed"/>
-    <w:sig w:usb0="E00002FF" w:usb1="0000FCFF" w:usb2="00000001" w:usb3="00000000" w:csb0="0000019F" w:csb1="00000000"/>
-  </w:font>
-  <w:font w:name="Aptos">
-    <w:charset w:val="00"/>
-    <w:family w:val="swiss"/>
-    <w:pitch w:val="variable"/>
-    <w:sig w:usb0="20000287" w:usb1="00000003" w:usb2="00000000" w:usb3="00000000" w:csb0="0000019F" w:csb1="00000000"/>
-  </w:font>
-  <w:font w:name="Aptos Display">
-    <w:charset w:val="00"/>
-    <w:family w:val="swiss"/>
-    <w:pitch w:val="variable"/>
-    <w:sig w:usb0="20000287" w:usb1="00000003" w:usb2="00000000" w:usb3="00000000" w:csb0="0000019F" w:csb1="00000000"/>
-  </w:font>
-</w:fonts>
-</file>
-
-<file path=word/glossary/numbering.xml><?xml version="1.0" encoding="utf-8"?>
-<w:numbering xmlns:wpc="http://schemas.microsoft.com/office/word/2010/wordprocessingCanvas" xmlns:cx="http://schemas.microsoft.com/office/drawing/2014/chartex" xmlns:cx1="http://schemas.microsoft.com/office/drawing/2015/9/8/chartex" xmlns:cx2="http://schemas.microsoft.com/office/drawing/2015/10/21/chartex" xmlns:cx3="http://schemas.microsoft.com/office/drawing/2016/5/9/chartex" xmlns:cx4="http://schemas.microsoft.com/office/drawing/2016/5/10/chartex" xmlns:cx5="http://schemas.microsoft.com/office/drawing/2016/5/11/chartex" xmlns:cx6="http://schemas.microsoft.com/office/drawing/2016/5/12/chartex" xmlns:cx7="http://schemas.microsoft.com/office/drawing/2016/5/13/chartex" xmlns:cx8="http://schemas.microsoft.com/office/drawing/2016/5/14/chartex" xmlns:mc="http://schemas.openxmlformats.org/markup-compatibility/2006" xmlns:aink="http://schemas.microsoft.com/office/drawing/2016/ink" xmlns:am3d="http://schemas.microsoft.com/office/drawing/2017/model3d" xmlns:o="urn:schemas-microsoft-com:office:office" xmlns:oel="http://schemas.microsoft.com/office/2019/extlst" xmlns:r="http://schemas.openxmlformats.org/officeDocument/2006/relationships" xmlns:m="http://schemas.openxmlformats.org/officeDocument/2006/math" xmlns:v="urn:schemas-microsoft-com:vml" xmlns:wp14="http://schemas.microsoft.com/office/word/2010/wordprocessingDrawing" xmlns:wp="http://schemas.openxmlformats.org/drawingml/2006/wordprocessingDrawing" xmlns:w10="urn:schemas-microsoft-com:office:word" xmlns:w="http://schemas.openxmlformats.org/wordprocessingml/2006/main" xmlns:w14="http://schemas.microsoft.com/office/word/2010/wordml" xmlns:w15="http://schemas.microsoft.com/office/word/2012/wordml" xmlns:w16cex="http://schemas.microsoft.com/office/word/2018/wordml/cex" xmlns:w16cid="http://schemas.microsoft.com/office/word/2016/wordml/cid" xmlns:w16="http://schemas.microsoft.com/office/word/2018/wordml" xmlns:w16du="http://schemas.microsoft.com/office/word/2023/wordml/word16du" xmlns:w16sdtdh="http://schemas.microsoft.com/office/word/2020/wordml/sdtdatahash" xmlns:w16sdtfl="http://schemas.microsoft.com/office/word/2024/wordml/sdtformatlock" xmlns:w16se="http://schemas.microsoft.com/office/word/2015/wordml/symex" xmlns:wpg="http://schemas.microsoft.com/office/word/2010/wordprocessingGroup" xmlns:wpi="http://schemas.microsoft.com/office/word/2010/wordprocessingInk" xmlns:wne="http://schemas.microsoft.com/office/word/2006/wordml" xmlns:wps="http://schemas.microsoft.com/office/word/2010/wordprocessingShape" mc:Ignorable="w14 w15 w16se w16cid w16 w16cex w16sdtdh w16sdtfl w16du wp14">
-  <w:abstractNum w:abstractNumId="0" w15:restartNumberingAfterBreak="0">
-    <w:nsid w:val="06C7362E"/>
-    <w:multiLevelType w:val="hybridMultilevel"/>
-    <w:tmpl w:val="078A913A"/>
-    <w:lvl w:ilvl="0" w:tplc="F108703C">
-      <w:start w:val="1"/>
-      <w:numFmt w:val="bullet"/>
-      <w:pStyle w:val="ListBullet"/>
-      <w:lvlText w:val=""/>
-      <w:lvlJc w:val="left"/>
-      <w:pPr>
-        <w:tabs>
-          <w:tab w:val="num" w:pos="389"/>
-        </w:tabs>
-        <w:ind w:left="389" w:hanging="389"/>
-      </w:pPr>
-      <w:rPr>
-        <w:rFonts w:ascii="Symbol" w:hAnsi="Symbol" w:hint="default"/>
-      </w:rPr>
-    </w:lvl>
-    <w:lvl w:ilvl="1" w:tplc="04090003" w:tentative="1">
-      <w:start w:val="1"/>
-      <w:numFmt w:val="bullet"/>
-      <w:lvlText w:val="o"/>
-      <w:lvlJc w:val="left"/>
-      <w:pPr>
-        <w:ind w:left="1440" w:hanging="360"/>
-      </w:pPr>
-      <w:rPr>
-        <w:rFonts w:ascii="Courier New" w:hAnsi="Courier New" w:cs="Courier New" w:hint="default"/>
-      </w:rPr>
-    </w:lvl>
-    <w:lvl w:ilvl="2" w:tplc="04090005" w:tentative="1">
-      <w:start w:val="1"/>
-      <w:numFmt w:val="bullet"/>
-      <w:lvlText w:val=""/>
-      <w:lvlJc w:val="left"/>
-      <w:pPr>
-        <w:ind w:left="2160" w:hanging="360"/>
-      </w:pPr>
-      <w:rPr>
-        <w:rFonts w:ascii="Wingdings" w:hAnsi="Wingdings" w:hint="default"/>
-      </w:rPr>
-    </w:lvl>
-    <w:lvl w:ilvl="3" w:tplc="04090001" w:tentative="1">
-      <w:start w:val="1"/>
-      <w:numFmt w:val="bullet"/>
-      <w:lvlText w:val=""/>
-      <w:lvlJc w:val="left"/>
-      <w:pPr>
-        <w:ind w:left="2880" w:hanging="360"/>
-      </w:pPr>
-      <w:rPr>
-        <w:rFonts w:ascii="Symbol" w:hAnsi="Symbol" w:hint="default"/>
-      </w:rPr>
-    </w:lvl>
-    <w:lvl w:ilvl="4" w:tplc="04090003" w:tentative="1">
-      <w:start w:val="1"/>
-      <w:numFmt w:val="bullet"/>
-      <w:lvlText w:val="o"/>
-      <w:lvlJc w:val="left"/>
-      <w:pPr>
-        <w:ind w:left="3600" w:hanging="360"/>
-      </w:pPr>
-      <w:rPr>
-        <w:rFonts w:ascii="Courier New" w:hAnsi="Courier New" w:cs="Courier New" w:hint="default"/>
-      </w:rPr>
-    </w:lvl>
-    <w:lvl w:ilvl="5" w:tplc="04090005" w:tentative="1">
-      <w:start w:val="1"/>
-      <w:numFmt w:val="bullet"/>
-      <w:lvlText w:val=""/>
-      <w:lvlJc w:val="left"/>
-      <w:pPr>
-        <w:ind w:left="4320" w:hanging="360"/>
-      </w:pPr>
-      <w:rPr>
-        <w:rFonts w:ascii="Wingdings" w:hAnsi="Wingdings" w:hint="default"/>
-      </w:rPr>
-    </w:lvl>
-    <w:lvl w:ilvl="6" w:tplc="04090001" w:tentative="1">
-      <w:start w:val="1"/>
-      <w:numFmt w:val="bullet"/>
-      <w:lvlText w:val=""/>
-      <w:lvlJc w:val="left"/>
-      <w:pPr>
-        <w:ind w:left="5040" w:hanging="360"/>
-      </w:pPr>
-      <w:rPr>
-        <w:rFonts w:ascii="Symbol" w:hAnsi="Symbol" w:hint="default"/>
-      </w:rPr>
-    </w:lvl>
-    <w:lvl w:ilvl="7" w:tplc="04090003" w:tentative="1">
-      <w:start w:val="1"/>
-      <w:numFmt w:val="bullet"/>
-      <w:lvlText w:val="o"/>
-      <w:lvlJc w:val="left"/>
-      <w:pPr>
-        <w:ind w:left="5760" w:hanging="360"/>
-      </w:pPr>
-      <w:rPr>
-        <w:rFonts w:ascii="Courier New" w:hAnsi="Courier New" w:cs="Courier New" w:hint="default"/>
-      </w:rPr>
-    </w:lvl>
-    <w:lvl w:ilvl="8" w:tplc="04090005" w:tentative="1">
-      <w:start w:val="1"/>
-      <w:numFmt w:val="bullet"/>
-      <w:lvlText w:val=""/>
-      <w:lvlJc w:val="left"/>
-      <w:pPr>
-        <w:ind w:left="6480" w:hanging="360"/>
-      </w:pPr>
-      <w:rPr>
-        <w:rFonts w:ascii="Wingdings" w:hAnsi="Wingdings" w:hint="default"/>
-      </w:rPr>
-    </w:lvl>
-  </w:abstractNum>
-  <w:num w:numId="1" w16cid:durableId="473451847">
-    <w:abstractNumId w:val="0"/>
-  </w:num>
-</w:numbering>
-</file>
-
-<file path=word/glossary/settings.xml><?xml version="1.0" encoding="utf-8"?>
-<w:settings xmlns:mc="http://schemas.openxmlformats.org/markup-compatibility/2006" xmlns:o="urn:schemas-microsoft-com:office:office" xmlns:r="http://schemas.openxmlformats.org/officeDocument/2006/relationships" xmlns:m="http://schemas.openxmlformats.org/officeDocument/2006/math" xmlns:v="urn:schemas-microsoft-com:vml" xmlns:w10="urn:schemas-microsoft-com:office:word" xmlns:w="http://schemas.openxmlformats.org/wordprocessingml/2006/main" xmlns:w14="http://schemas.microsoft.com/office/word/2010/wordml" xmlns:w15="http://schemas.microsoft.com/office/word/2012/wordml" xmlns:w16cex="http://schemas.microsoft.com/office/word/2018/wordml/cex" xmlns:w16cid="http://schemas.microsoft.com/office/word/2016/wordml/cid" xmlns:w16="http://schemas.microsoft.com/office/word/2018/wordml" xmlns:w16du="http://schemas.microsoft.com/office/word/2023/wordml/word16du" xmlns:w16sdtdh="http://schemas.microsoft.com/office/word/2020/wordml/sdtdatahash" xmlns:w16sdtfl="http://schemas.microsoft.com/office/word/2024/wordml/sdtformatlock" xmlns:w16se="http://schemas.microsoft.com/office/word/2015/wordml/symex" xmlns:sl="http://schemas.openxmlformats.org/schemaLibrary/2006/main" mc:Ignorable="w14 w15 w16se w16cid w16 w16cex w16sdtdh w16sdtfl w16du">
-  <w:view w:val="normal"/>
-  <w:defaultTabStop w:val="720"/>
-  <w:characterSpacingControl w:val="doNotCompress"/>
-  <w:compat>
-    <w:useFELayout/>
-    <w:compatSetting w:name="compatibilityMode" w:uri="http://schemas.microsoft.com/office/word" w:val="15"/>
-    <w:compatSetting w:name="overrideTableStyleFontSizeAndJustification" w:uri="http://schemas.microsoft.com/office/word" w:val="1"/>
-    <w:compatSetting w:name="enableOpenTypeFeatures" w:uri="http://schemas.microsoft.com/office/word" w:val="1"/>
-    <w:compatSetting w:name="doNotFlipMirrorIndents" w:uri="http://schemas.microsoft.com/office/word" w:val="1"/>
-    <w:compatSetting w:name="differentiateMultirowTableHeaders" w:uri="http://schemas.microsoft.com/office/word" w:val="1"/>
-    <w:compatSetting w:name="useWord2013TrackBottomHyphenation" w:uri="http://schemas.microsoft.com/office/word" w:val="0"/>
-  </w:compat>
-  <w:rsids>
-    <w:rsidRoot w:val="003451E5"/>
-    <w:rsid w:val="003451E5"/>
-    <w:rsid w:val="00CF5C30"/>
-  </w:rsids>
-  <m:mathPr>
-    <m:mathFont m:val="Cambria Math"/>
-    <m:brkBin m:val="before"/>
-    <m:brkBinSub m:val="--"/>
-    <m:smallFrac m:val="0"/>
-    <m:dispDef/>
-    <m:lMargin m:val="0"/>
-    <m:rMargin m:val="0"/>
-    <m:defJc m:val="centerGroup"/>
-    <m:wrapIndent m:val="1440"/>
-    <m:intLim m:val="subSup"/>
-    <m:naryLim m:val="undOvr"/>
-  </m:mathPr>
-  <w:themeFontLang w:val="en-US" w:bidi="ar-SA"/>
-  <w:clrSchemeMapping w:bg1="light1" w:t1="dark1" w:bg2="light2" w:t2="dark2" w:accent1="accent1" w:accent2="accent2" w:accent3="accent3" w:accent4="accent4" w:accent5="accent5" w:accent6="accent6" w:hyperlink="hyperlink" w:followedHyperlink="followedHyperlink"/>
-  <w:decimalSymbol w:val="."/>
-  <w:listSeparator w:val=","/>
-  <w15:chartTrackingRefBased/>
-</w:settings>
-</file>
-
-<file path=word/glossary/styles.xml><?xml version="1.0" encoding="utf-8"?>
-<w:styles xmlns:mc="http://schemas.openxmlformats.org/markup-compatibility/2006" xmlns:r="http://schemas.openxmlformats.org/officeDocument/2006/relationships" xmlns:w="http://schemas.openxmlformats.org/wordprocessingml/2006/main" xmlns:w14="http://schemas.microsoft.com/office/word/2010/wordml" xmlns:w15="http://schemas.microsoft.com/office/word/2012/wordml" xmlns:w16cex="http://schemas.microsoft.com/office/word/2018/wordml/cex" xmlns:w16cid="http://schemas.microsoft.com/office/word/2016/wordml/cid" xmlns:w16="http://schemas.microsoft.com/office/word/2018/wordml" xmlns:w16du="http://schemas.microsoft.com/office/word/2023/wordml/word16du" xmlns:w16sdtdh="http://schemas.microsoft.com/office/word/2020/wordml/sdtdatahash" xmlns:w16sdtfl="http://schemas.microsoft.com/office/word/2024/wordml/sdtformatlock" xmlns:w16se="http://schemas.microsoft.com/office/word/2015/wordml/symex" mc:Ignorable="w14 w15 w16se w16cid w16 w16cex w16sdtdh w16sdtfl w16du">
-  <w:docDefaults>
-    <w:rPrDefault>
-      <w:rPr>
-        <w:rFonts w:asciiTheme="minorHAnsi" w:eastAsiaTheme="minorEastAsia" w:hAnsiTheme="minorHAnsi" w:cstheme="minorBidi"/>
-        <w:kern w:val="2"/>
-        <w:sz w:val="24"/>
-        <w:szCs w:val="24"/>
-        <w:lang w:val="en-US" w:eastAsia="en-US" w:bidi="ar-SA"/>
-        <w14:ligatures w14:val="standardContextual"/>
-      </w:rPr>
-    </w:rPrDefault>
-    <w:pPrDefault>
-      <w:pPr>
-        <w:spacing w:after="160" w:line="278" w:lineRule="auto"/>
-      </w:pPr>
-    </w:pPrDefault>
-  </w:docDefaults>
-  <w:latentStyles w:defLockedState="0" w:defUIPriority="99" w:defSemiHidden="0" w:defUnhideWhenUsed="0" w:defQFormat="0" w:count="376">
-    <w:lsdException w:name="Normal" w:uiPriority="0" w:qFormat="1"/>
-    <w:lsdException w:name="heading 1" w:uiPriority="9" w:qFormat="1"/>
-    <w:lsdException w:name="heading 2" w:semiHidden="1" w:uiPriority="9" w:unhideWhenUsed="1" w:qFormat="1"/>
-    <w:lsdException w:name="heading 3" w:semiHidden="1" w:uiPriority="9" w:unhideWhenUsed="1" w:qFormat="1"/>
-    <w:lsdException w:name="heading 4" w:semiHidden="1" w:uiPriority="9" w:unhideWhenUsed="1" w:qFormat="1"/>
-    <w:lsdException w:name="heading 5" w:semiHidden="1" w:uiPriority="9" w:unhideWhenUsed="1" w:qFormat="1"/>
-    <w:lsdException w:name="heading 6" w:semiHidden="1" w:uiPriority="9" w:unhideWhenUsed="1" w:qFormat="1"/>
-    <w:lsdException w:name="heading 7" w:semiHidden="1" w:uiPriority="9" w:unhideWhenUsed="1" w:qFormat="1"/>
-    <w:lsdException w:name="heading 8" w:semiHidden="1" w:uiPriority="9" w:unhideWhenUsed="1" w:qFormat="1"/>
-    <w:lsdException w:name="heading 9" w:semiHidden="1" w:uiPriority="9" w:unhideWhenUsed="1" w:qFormat="1"/>
-    <w:lsdException w:name="index 1" w:semiHidden="1" w:unhideWhenUsed="1"/>
-    <w:lsdException w:name="index 2" w:semiHidden="1" w:unhideWhenUsed="1"/>
-    <w:lsdException w:name="index 3" w:semiHidden="1" w:unhideWhenUsed="1"/>
-    <w:lsdException w:name="index 4" w:semiHidden="1" w:unhideWhenUsed="1"/>
-    <w:lsdException w:name="index 5" w:semiHidden="1" w:unhideWhenUsed="1"/>
-    <w:lsdException w:name="index 6" w:semiHidden="1" w:unhideWhenUsed="1"/>
-    <w:lsdException w:name="index 7" w:semiHidden="1" w:unhideWhenUsed="1"/>
-    <w:lsdException w:name="index 8" w:semiHidden="1" w:unhideWhenUsed="1"/>
-    <w:lsdException w:name="index 9" w:semiHidden="1" w:unhideWhenUsed="1"/>
-    <w:lsdException w:name="toc 1" w:semiHidden="1" w:uiPriority="39" w:unhideWhenUsed="1"/>
-    <w:lsdException w:name="toc 2" w:semiHidden="1" w:uiPriority="39" w:unhideWhenUsed="1"/>
-    <w:lsdException w:name="toc 3" w:semiHidden="1" w:uiPriority="39" w:unhideWhenUsed="1"/>
-    <w:lsdException w:name="toc 4" w:semiHidden="1" w:uiPriority="39" w:unhideWhenUsed="1"/>
-    <w:lsdException w:name="toc 5" w:semiHidden="1" w:uiPriority="39" w:unhideWhenUsed="1"/>
-    <w:lsdException w:name="toc 6" w:semiHidden="1" w:uiPriority="39" w:unhideWhenUsed="1"/>
-    <w:lsdException w:name="toc 7" w:semiHidden="1" w:uiPriority="39" w:unhideWhenUsed="1"/>
-    <w:lsdException w:name="toc 8" w:semiHidden="1" w:uiPriority="39" w:unhideWhenUsed="1"/>
-    <w:lsdException w:name="toc 9" w:semiHidden="1" w:uiPriority="39" w:unhideWhenUsed="1"/>
-    <w:lsdException w:name="Normal Indent" w:semiHidden="1" w:unhideWhenUsed="1"/>
-    <w:lsdException w:name="footnote text" w:semiHidden="1" w:unhideWhenUsed="1"/>
-    <w:lsdException w:name="annotation text" w:semiHidden="1" w:unhideWhenUsed="1"/>
-    <w:lsdException w:name="header" w:semiHidden="1" w:unhideWhenUsed="1"/>
-    <w:lsdException w:name="footer" w:semiHidden="1" w:unhideWhenUsed="1"/>
-    <w:lsdException w:name="index heading" w:semiHidden="1" w:unhideWhenUsed="1"/>
-    <w:lsdException w:name="caption" w:semiHidden="1" w:uiPriority="35" w:unhideWhenUsed="1" w:qFormat="1"/>
-    <w:lsdException w:name="table of figures" w:semiHidden="1" w:unhideWhenUsed="1"/>
-    <w:lsdException w:name="envelope address" w:semiHidden="1" w:unhideWhenUsed="1"/>
-    <w:lsdException w:name="envelope return" w:semiHidden="1" w:unhideWhenUsed="1"/>
-    <w:lsdException w:name="footnote reference" w:semiHidden="1" w:unhideWhenUsed="1"/>
-    <w:lsdException w:name="annotation reference" w:semiHidden="1" w:unhideWhenUsed="1"/>
-    <w:lsdException w:name="line number" w:semiHidden="1" w:unhideWhenUsed="1"/>
-    <w:lsdException w:name="page number" w:semiHidden="1" w:unhideWhenUsed="1"/>
-    <w:lsdException w:name="endnote reference" w:semiHidden="1" w:unhideWhenUsed="1"/>
-    <w:lsdException w:name="endnote text" w:semiHidden="1" w:unhideWhenUsed="1"/>
-    <w:lsdException w:name="table of authorities" w:semiHidden="1" w:unhideWhenUsed="1"/>
-    <w:lsdException w:name="macro" w:semiHidden="1" w:unhideWhenUsed="1"/>
-    <w:lsdException w:name="toa heading" w:semiHidden="1" w:unhideWhenUsed="1"/>
-    <w:lsdException w:name="List" w:semiHidden="1" w:unhideWhenUsed="1"/>
-    <w:lsdException w:name="List Bullet" w:semiHidden="1" w:uiPriority="10" w:unhideWhenUsed="1" w:qFormat="1"/>
-    <w:lsdException w:name="List Number" w:semiHidden="1" w:unhideWhenUsed="1"/>
-    <w:lsdException w:name="List 2" w:semiHidden="1" w:unhideWhenUsed="1"/>
-    <w:lsdException w:name="List 3" w:semiHidden="1" w:unhideWhenUsed="1"/>
-    <w:lsdException w:name="List 4" w:semiHidden="1" w:unhideWhenUsed="1"/>
-    <w:lsdException w:name="List 5" w:semiHidden="1" w:unhideWhenUsed="1"/>
-    <w:lsdException w:name="List Bullet 2" w:semiHidden="1" w:unhideWhenUsed="1"/>
-    <w:lsdException w:name="List Bullet 3" w:semiHidden="1" w:unhideWhenUsed="1"/>
-    <w:lsdException w:name="List Bullet 4" w:semiHidden="1" w:unhideWhenUsed="1"/>
-    <w:lsdException w:name="List Bullet 5" w:semiHidden="1" w:unhideWhenUsed="1"/>
-    <w:lsdException w:name="List Number 2" w:semiHidden="1" w:unhideWhenUsed="1"/>
-    <w:lsdException w:name="List Number 3" w:semiHidden="1" w:unhideWhenUsed="1"/>
-    <w:lsdException w:name="List Number 4" w:semiHidden="1" w:unhideWhenUsed="1"/>
-    <w:lsdException w:name="List Number 5" w:semiHidden="1" w:unhideWhenUsed="1"/>
-    <w:lsdException w:name="Title" w:uiPriority="10" w:qFormat="1"/>
-    <w:lsdException w:name="Closing" w:semiHidden="1" w:unhideWhenUsed="1"/>
-    <w:lsdException w:name="Signature" w:semiHidden="1" w:unhideWhenUsed="1"/>
-    <w:lsdException w:name="Default Paragraph Font" w:semiHidden="1" w:uiPriority="1" w:unhideWhenUsed="1"/>
-    <w:lsdException w:name="Body Text" w:semiHidden="1" w:unhideWhenUsed="1"/>
-    <w:lsdException w:name="Body Text Indent" w:semiHidden="1" w:unhideWhenUsed="1"/>
-    <w:lsdException w:name="List Continue" w:semiHidden="1" w:unhideWhenUsed="1"/>
-    <w:lsdException w:name="List Continue 2" w:semiHidden="1" w:unhideWhenUsed="1"/>
-    <w:lsdException w:name="List Continue 3" w:semiHidden="1" w:unhideWhenUsed="1"/>
-    <w:lsdException w:name="List Continue 4" w:semiHidden="1" w:unhideWhenUsed="1"/>
-    <w:lsdException w:name="List Continue 5" w:semiHidden="1" w:unhideWhenUsed="1"/>
-    <w:lsdException w:name="Message Header" w:semiHidden="1" w:unhideWhenUsed="1"/>
-    <w:lsdException w:name="Subtitle" w:uiPriority="11" w:qFormat="1"/>
-    <w:lsdException w:name="Salutation" w:semiHidden="1" w:unhideWhenUsed="1"/>
-    <w:lsdException w:name="Date" w:semiHidden="1" w:unhideWhenUsed="1"/>
-    <w:lsdException w:name="Body Text First Indent" w:semiHidden="1" w:unhideWhenUsed="1"/>
-    <w:lsdException w:name="Body Text First Indent 2" w:semiHidden="1" w:unhideWhenUsed="1"/>
-    <w:lsdException w:name="Note Heading" w:semiHidden="1" w:unhideWhenUsed="1"/>
-    <w:lsdException w:name="Body Text 2" w:semiHidden="1" w:unhideWhenUsed="1"/>
-    <w:lsdException w:name="Body Text 3" w:semiHidden="1" w:unhideWhenUsed="1"/>
-    <w:lsdException w:name="Body Text Indent 2" w:semiHidden="1" w:unhideWhenUsed="1"/>
-    <w:lsdException w:name="Body Text Indent 3" w:semiHidden="1" w:unhideWhenUsed="1"/>
-    <w:lsdException w:name="Block Text" w:semiHidden="1" w:unhideWhenUsed="1"/>
-    <w:lsdException w:name="Hyperlink" w:semiHidden="1" w:unhideWhenUsed="1"/>
-    <w:lsdException w:name="FollowedHyperlink" w:semiHidden="1" w:unhideWhenUsed="1"/>
-    <w:lsdException w:name="Strong" w:uiPriority="22" w:qFormat="1"/>
-    <w:lsdException w:name="Emphasis" w:uiPriority="20" w:qFormat="1"/>
-    <w:lsdException w:name="Document Map" w:semiHidden="1" w:unhideWhenUsed="1"/>
-    <w:lsdException w:name="Plain Text" w:semiHidden="1" w:unhideWhenUsed="1"/>
-    <w:lsdException w:name="E-mail Signature" w:semiHidden="1" w:unhideWhenUsed="1"/>
-    <w:lsdException w:name="HTML Top of Form" w:semiHidden="1" w:unhideWhenUsed="1"/>
-    <w:lsdException w:name="HTML Bottom of Form" w:semiHidden="1" w:unhideWhenUsed="1"/>
-    <w:lsdException w:name="Normal (Web)" w:semiHidden="1" w:unhideWhenUsed="1"/>
-    <w:lsdException w:name="HTML Acronym" w:semiHidden="1" w:unhideWhenUsed="1"/>
-    <w:lsdException w:name="HTML Address" w:semiHidden="1" w:unhideWhenUsed="1"/>
-    <w:lsdException w:name="HTML Cite" w:semiHidden="1" w:unhideWhenUsed="1"/>
-    <w:lsdException w:name="HTML Code" w:semiHidden="1" w:unhideWhenUsed="1"/>
-    <w:lsdException w:name="HTML Definition" w:semiHidden="1" w:unhideWhenUsed="1"/>
-    <w:lsdException w:name="HTML Keyboard" w:semiHidden="1" w:unhideWhenUsed="1"/>
-    <w:lsdException w:name="HTML Preformatted" w:semiHidden="1" w:unhideWhenUsed="1"/>
-    <w:lsdException w:name="HTML Sample" w:semiHidden="1" w:unhideWhenUsed="1"/>
-    <w:lsdException w:name="HTML Typewriter" w:semiHidden="1" w:unhideWhenUsed="1"/>
-    <w:lsdException w:name="HTML Variable" w:semiHidden="1" w:unhideWhenUsed="1"/>
-    <w:lsdException w:name="Normal Table" w:semiHidden="1" w:unhideWhenUsed="1"/>
-    <w:lsdException w:name="annotation subject" w:semiHidden="1" w:unhideWhenUsed="1"/>
-    <w:lsdException w:name="No List" w:semiHidden="1" w:unhideWhenUsed="1"/>
-    <w:lsdException w:name="Outline List 1" w:semiHidden="1" w:unhideWhenUsed="1"/>
-    <w:lsdException w:name="Outline List 2" w:semiHidden="1" w:unhideWhenUsed="1"/>
-    <w:lsdException w:name="Outline List 3" w:semiHidden="1" w:unhideWhenUsed="1"/>
-    <w:lsdException w:name="Table Simple 1" w:semiHidden="1" w:unhideWhenUsed="1"/>
-    <w:lsdException w:name="Table Simple 2" w:semiHidden="1" w:unhideWhenUsed="1"/>
-    <w:lsdException w:name="Table Simple 3" w:semiHidden="1" w:unhideWhenUsed="1"/>
-    <w:lsdException w:name="Table Classic 1" w:semiHidden="1" w:unhideWhenUsed="1"/>
-    <w:lsdException w:name="Table Classic 2" w:semiHidden="1" w:unhideWhenUsed="1"/>
-    <w:lsdException w:name="Table Classic 3" w:semiHidden="1" w:unhideWhenUsed="1"/>
-    <w:lsdException w:name="Table Classic 4" w:semiHidden="1" w:unhideWhenUsed="1"/>
-    <w:lsdException w:name="Table Colorful 1" w:semiHidden="1" w:unhideWhenUsed="1"/>
-    <w:lsdException w:name="Table Colorful 2" w:semiHidden="1" w:unhideWhenUsed="1"/>
-    <w:lsdException w:name="Table Colorful 3" w:semiHidden="1" w:unhideWhenUsed="1"/>
-    <w:lsdException w:name="Table Columns 1" w:semiHidden="1" w:unhideWhenUsed="1"/>
-    <w:lsdException w:name="Table Columns 2" w:semiHidden="1" w:unhideWhenUsed="1"/>
-    <w:lsdException w:name="Table Columns 3" w:semiHidden="1" w:unhideWhenUsed="1"/>
-    <w:lsdException w:name="Table Columns 4" w:semiHidden="1" w:unhideWhenUsed="1"/>
-    <w:lsdException w:name="Table Columns 5" w:semiHidden="1" w:unhideWhenUsed="1"/>
-    <w:lsdException w:name="Table Grid 1" w:semiHidden="1" w:unhideWhenUsed="1"/>
-    <w:lsdException w:name="Table Grid 2" w:semiHidden="1" w:unhideWhenUsed="1"/>
-    <w:lsdException w:name="Table Grid 3" w:semiHidden="1" w:unhideWhenUsed="1"/>
-    <w:lsdException w:name="Table Grid 4" w:semiHidden="1" w:unhideWhenUsed="1"/>
-    <w:lsdException w:name="Table Grid 5" w:semiHidden="1" w:unhideWhenUsed="1"/>
-    <w:lsdException w:name="Table Grid 6" w:semiHidden="1" w:unhideWhenUsed="1"/>
-    <w:lsdException w:name="Table Grid 7" w:semiHidden="1" w:unhideWhenUsed="1"/>
-    <w:lsdException w:name="Table Grid 8" w:semiHidden="1" w:unhideWhenUsed="1"/>
-    <w:lsdException w:name="Table List 1" w:semiHidden="1" w:unhideWhenUsed="1"/>
-    <w:lsdException w:name="Table List 2" w:semiHidden="1" w:unhideWhenUsed="1"/>
-    <w:lsdException w:name="Table List 3" w:semiHidden="1" w:unhideWhenUsed="1"/>
-    <w:lsdException w:name="Table List 4" w:semiHidden="1" w:unhideWhenUsed="1"/>
-    <w:lsdException w:name="Table List 5" w:semiHidden="1" w:unhideWhenUsed="1"/>
-    <w:lsdException w:name="Table List 6" w:semiHidden="1" w:unhideWhenUsed="1"/>
-    <w:lsdException w:name="Table List 7" w:semiHidden="1" w:unhideWhenUsed="1"/>
-    <w:lsdException w:name="Table List 8" w:semiHidden="1" w:unhideWhenUsed="1"/>
-    <w:lsdException w:name="Table 3D effects 1" w:semiHidden="1" w:unhideWhenUsed="1"/>
-    <w:lsdException w:name="Table 3D effects 2" w:semiHidden="1" w:unhideWhenUsed="1"/>
-    <w:lsdException w:name="Table 3D effects 3" w:semiHidden="1" w:unhideWhenUsed="1"/>
-    <w:lsdException w:name="Table Contemporary" w:semiHidden="1" w:unhideWhenUsed="1"/>
-    <w:lsdException w:name="Table Elegant" w:semiHidden="1" w:unhideWhenUsed="1"/>
-    <w:lsdException w:name="Table Professional" w:semiHidden="1" w:unhideWhenUsed="1"/>
-    <w:lsdException w:name="Table Subtle 1" w:semiHidden="1" w:unhideWhenUsed="1"/>
-    <w:lsdException w:name="Table Subtle 2" w:semiHidden="1" w:unhideWhenUsed="1"/>
-    <w:lsdException w:name="Table Web 1" w:semiHidden="1" w:unhideWhenUsed="1"/>
-    <w:lsdException w:name="Table Web 2" w:semiHidden="1" w:unhideWhenUsed="1"/>
-    <w:lsdException w:name="Table Web 3" w:semiHidden="1" w:unhideWhenUsed="1"/>
-    <w:lsdException w:name="Balloon Text" w:semiHidden="1" w:unhideWhenUsed="1"/>
-    <w:lsdException w:name="Table Grid" w:uiPriority="39"/>
-    <w:lsdException w:name="Table Theme" w:semiHidden="1" w:unhideWhenUsed="1"/>
-    <w:lsdException w:name="Placeholder Text" w:semiHidden="1"/>
-    <w:lsdException w:name="No Spacing" w:uiPriority="1" w:qFormat="1"/>
-    <w:lsdException w:name="Light Shading" w:uiPriority="60"/>
-    <w:lsdException w:name="Light List" w:uiPriority="61"/>
-    <w:lsdException w:name="Light Grid" w:uiPriority="62"/>
-    <w:lsdException w:name="Medium Shading 1" w:uiPriority="63"/>
-    <w:lsdException w:name="Medium Shading 2" w:uiPriority="64"/>
-    <w:lsdException w:name="Medium List 1" w:uiPriority="65"/>
-    <w:lsdException w:name="Medium List 2" w:uiPriority="66"/>
-    <w:lsdException w:name="Medium Grid 1" w:uiPriority="67"/>
-    <w:lsdException w:name="Medium Grid 2" w:uiPriority="68"/>
-    <w:lsdException w:name="Medium Grid 3" w:uiPriority="69"/>
-    <w:lsdException w:name="Dark List" w:uiPriority="70"/>
-    <w:lsdException w:name="Colorful Shading" w:uiPriority="71"/>
-    <w:lsdException w:name="Colorful List" w:uiPriority="72"/>
-    <w:lsdException w:name="Colorful Grid" w:uiPriority="73"/>
-    <w:lsdException w:name="Light Shading Accent 1" w:uiPriority="60"/>
-    <w:lsdException w:name="Light List Accent 1" w:uiPriority="61"/>
-    <w:lsdException w:name="Light Grid Accent 1" w:uiPriority="62"/>
-    <w:lsdException w:name="Medium Shading 1 Accent 1" w:uiPriority="63"/>
-    <w:lsdException w:name="Medium Shading 2 Accent 1" w:uiPriority="64"/>
-    <w:lsdException w:name="Medium List 1 Accent 1" w:uiPriority="65"/>
-    <w:lsdException w:name="Revision" w:semiHidden="1"/>
-    <w:lsdException w:name="List Paragraph" w:uiPriority="34" w:qFormat="1"/>
-    <w:lsdException w:name="Quote" w:uiPriority="29" w:qFormat="1"/>
-    <w:lsdException w:name="Intense Quote" w:uiPriority="30" w:qFormat="1"/>
-    <w:lsdException w:name="Medium List 2 Accent 1" w:uiPriority="66"/>
-    <w:lsdException w:name="Medium Grid 1 Accent 1" w:uiPriority="67"/>
-    <w:lsdException w:name="Medium Grid 2 Accent 1" w:uiPriority="68"/>
-    <w:lsdException w:name="Medium Grid 3 Accent 1" w:uiPriority="69"/>
-    <w:lsdException w:name="Dark List Accent 1" w:uiPriority="70"/>
-    <w:lsdException w:name="Colorful Shading Accent 1" w:uiPriority="71"/>
-    <w:lsdException w:name="Colorful List Accent 1" w:uiPriority="72"/>
-    <w:lsdException w:name="Colorful Grid Accent 1" w:uiPriority="73"/>
-    <w:lsdException w:name="Light Shading Accent 2" w:uiPriority="60"/>
-    <w:lsdException w:name="Light List Accent 2" w:uiPriority="61"/>
-    <w:lsdException w:name="Light Grid Accent 2" w:uiPriority="62"/>
-    <w:lsdException w:name="Medium Shading 1 Accent 2" w:uiPriority="63"/>
-    <w:lsdException w:name="Medium Shading 2 Accent 2" w:uiPriority="64"/>
-    <w:lsdException w:name="Medium List 1 Accent 2" w:uiPriority="65"/>
-    <w:lsdException w:name="Medium List 2 Accent 2" w:uiPriority="66"/>
-    <w:lsdException w:name="Medium Grid 1 Accent 2" w:uiPriority="67"/>
-    <w:lsdException w:name="Medium Grid 2 Accent 2" w:uiPriority="68"/>
-    <w:lsdException w:name="Medium Grid 3 Accent 2" w:uiPriority="69"/>
-    <w:lsdException w:name="Dark List Accent 2" w:uiPriority="70"/>
-    <w:lsdException w:name="Colorful Shading Accent 2" w:uiPriority="71"/>
-    <w:lsdException w:name="Colorful List Accent 2" w:uiPriority="72"/>
-    <w:lsdException w:name="Colorful Grid Accent 2" w:uiPriority="73"/>
-    <w:lsdException w:name="Light Shading Accent 3" w:uiPriority="60"/>
-    <w:lsdException w:name="Light List Accent 3" w:uiPriority="61"/>
-    <w:lsdException w:name="Light Grid Accent 3" w:uiPriority="62"/>
-    <w:lsdException w:name="Medium Shading 1 Accent 3" w:uiPriority="63"/>
-    <w:lsdException w:name="Medium Shading 2 Accent 3" w:uiPriority="64"/>
-    <w:lsdException w:name="Medium List 1 Accent 3" w:uiPriority="65"/>
-    <w:lsdException w:name="Medium List 2 Accent 3" w:uiPriority="66"/>
-    <w:lsdException w:name="Medium Grid 1 Accent 3" w:uiPriority="67"/>
-    <w:lsdException w:name="Medium Grid 2 Accent 3" w:uiPriority="68"/>
-    <w:lsdException w:name="Medium Grid 3 Accent 3" w:uiPriority="69"/>
-    <w:lsdException w:name="Dark List Accent 3" w:uiPriority="70"/>
-    <w:lsdException w:name="Colorful Shading Accent 3" w:uiPriority="71"/>
-    <w:lsdException w:name="Colorful List Accent 3" w:uiPriority="72"/>
-    <w:lsdException w:name="Colorful Grid Accent 3" w:uiPriority="73"/>
-    <w:lsdException w:name="Light Shading Accent 4" w:uiPriority="60"/>
-    <w:lsdException w:name="Light List Accent 4" w:uiPriority="61"/>
-    <w:lsdException w:name="Light Grid Accent 4" w:uiPriority="62"/>
-    <w:lsdException w:name="Medium Shading 1 Accent 4" w:uiPriority="63"/>
-    <w:lsdException w:name="Medium Shading 2 Accent 4" w:uiPriority="64"/>
-    <w:lsdException w:name="Medium List 1 Accent 4" w:uiPriority="65"/>
-    <w:lsdException w:name="Medium List 2 Accent 4" w:uiPriority="66"/>
-    <w:lsdException w:name="Medium Grid 1 Accent 4" w:uiPriority="67"/>
-    <w:lsdException w:name="Medium Grid 2 Accent 4" w:uiPriority="68"/>
-    <w:lsdException w:name="Medium Grid 3 Accent 4" w:uiPriority="69"/>
-    <w:lsdException w:name="Dark List Accent 4" w:uiPriority="70"/>
-    <w:lsdException w:name="Colorful Shading Accent 4" w:uiPriority="71"/>
-    <w:lsdException w:name="Colorful List Accent 4" w:uiPriority="72"/>
-    <w:lsdException w:name="Colorful Grid Accent 4" w:uiPriority="73"/>
-    <w:lsdException w:name="Light Shading Accent 5" w:uiPriority="60"/>
-    <w:lsdException w:name="Light List Accent 5" w:uiPriority="61"/>
-    <w:lsdException w:name="Light Grid Accent 5" w:uiPriority="62"/>
-    <w:lsdException w:name="Medium Shading 1 Accent 5" w:uiPriority="63"/>
-    <w:lsdException w:name="Medium Shading 2 Accent 5" w:uiPriority="64"/>
-    <w:lsdException w:name="Medium List 1 Accent 5" w:uiPriority="65"/>
-    <w:lsdException w:name="Medium List 2 Accent 5" w:uiPriority="66"/>
-    <w:lsdException w:name="Medium Grid 1 Accent 5" w:uiPriority="67"/>
-    <w:lsdException w:name="Medium Grid 2 Accent 5" w:uiPriority="68"/>
-    <w:lsdException w:name="Medium Grid 3 Accent 5" w:uiPriority="69"/>
-    <w:lsdException w:name="Dark List Accent 5" w:uiPriority="70"/>
-    <w:lsdException w:name="Colorful Shading Accent 5" w:uiPriority="71"/>
-    <w:lsdException w:name="Colorful List Accent 5" w:uiPriority="72"/>
-    <w:lsdException w:name="Colorful Grid Accent 5" w:uiPriority="73"/>
-    <w:lsdException w:name="Light Shading Accent 6" w:uiPriority="60"/>
-    <w:lsdException w:name="Light List Accent 6" w:uiPriority="61"/>
-    <w:lsdException w:name="Light Grid Accent 6" w:uiPriority="62"/>
-    <w:lsdException w:name="Medium Shading 1 Accent 6" w:uiPriority="63"/>
-    <w:lsdException w:name="Medium Shading 2 Accent 6" w:uiPriority="64"/>
-    <w:lsdException w:name="Medium List 1 Accent 6" w:uiPriority="65"/>
-    <w:lsdException w:name="Medium List 2 Accent 6" w:uiPriority="66"/>
-    <w:lsdException w:name="Medium Grid 1 Accent 6" w:uiPriority="67"/>
-    <w:lsdException w:name="Medium Grid 2 Accent 6" w:uiPriority="68"/>
-    <w:lsdException w:name="Medium Grid 3 Accent 6" w:uiPriority="69"/>
-    <w:lsdException w:name="Dark List Accent 6" w:uiPriority="70"/>
-    <w:lsdException w:name="Colorful Shading Accent 6" w:uiPriority="71"/>
-    <w:lsdException w:name="Colorful List Accent 6" w:uiPriority="72"/>
-    <w:lsdException w:name="Colorful Grid Accent 6" w:uiPriority="73"/>
-    <w:lsdException w:name="Subtle Emphasis" w:uiPriority="19" w:qFormat="1"/>
-    <w:lsdException w:name="Intense Emphasis" w:uiPriority="21" w:qFormat="1"/>
-    <w:lsdException w:name="Subtle Reference" w:uiPriority="31" w:qFormat="1"/>
-    <w:lsdException w:name="Intense Reference" w:uiPriority="32" w:qFormat="1"/>
-    <w:lsdException w:name="Book Title" w:uiPriority="33" w:qFormat="1"/>
-    <w:lsdException w:name="Bibliography" w:semiHidden="1" w:uiPriority="37" w:unhideWhenUsed="1"/>
-    <w:lsdException w:name="TOC Heading" w:semiHidden="1" w:uiPriority="39" w:unhideWhenUsed="1" w:qFormat="1"/>
-    <w:lsdException w:name="Plain Table 1" w:uiPriority="41"/>
-    <w:lsdException w:name="Plain Table 2" w:uiPriority="42"/>
-    <w:lsdException w:name="Plain Table 3" w:uiPriority="43"/>
-    <w:lsdException w:name="Plain Table 4" w:uiPriority="44"/>
-    <w:lsdException w:name="Plain Table 5" w:uiPriority="45"/>
-    <w:lsdException w:name="Grid Table Light" w:uiPriority="40"/>
-    <w:lsdException w:name="Grid Table 1 Light" w:uiPriority="46"/>
-    <w:lsdException w:name="Grid Table 2" w:uiPriority="47"/>
-    <w:lsdException w:name="Grid Table 3" w:uiPriority="48"/>
-    <w:lsdException w:name="Grid Table 4" w:uiPriority="49"/>
-    <w:lsdException w:name="Grid Table 5 Dark" w:uiPriority="50"/>
-    <w:lsdException w:name="Grid Table 6 Colorful" w:uiPriority="51"/>
-    <w:lsdException w:name="Grid Table 7 Colorful" w:uiPriority="52"/>
-    <w:lsdException w:name="Grid Table 1 Light Accent 1" w:uiPriority="46"/>
-    <w:lsdException w:name="Grid Table 2 Accent 1" w:uiPriority="47"/>
-    <w:lsdException w:name="Grid Table 3 Accent 1" w:uiPriority="48"/>
-    <w:lsdException w:name="Grid Table 4 Accent 1" w:uiPriority="49"/>
-    <w:lsdException w:name="Grid Table 5 Dark Accent 1" w:uiPriority="50"/>
-    <w:lsdException w:name="Grid Table 6 Colorful Accent 1" w:uiPriority="51"/>
-    <w:lsdException w:name="Grid Table 7 Colorful Accent 1" w:uiPriority="52"/>
-    <w:lsdException w:name="Grid Table 1 Light Accent 2" w:uiPriority="46"/>
-    <w:lsdException w:name="Grid Table 2 Accent 2" w:uiPriority="47"/>
-    <w:lsdException w:name="Grid Table 3 Accent 2" w:uiPriority="48"/>
-    <w:lsdException w:name="Grid Table 4 Accent 2" w:uiPriority="49"/>
-    <w:lsdException w:name="Grid Table 5 Dark Accent 2" w:uiPriority="50"/>
-    <w:lsdException w:name="Grid Table 6 Colorful Accent 2" w:uiPriority="51"/>
-    <w:lsdException w:name="Grid Table 7 Colorful Accent 2" w:uiPriority="52"/>
-    <w:lsdException w:name="Grid Table 1 Light Accent 3" w:uiPriority="46"/>
-    <w:lsdException w:name="Grid Table 2 Accent 3" w:uiPriority="47"/>
-    <w:lsdException w:name="Grid Table 3 Accent 3" w:uiPriority="48"/>
-    <w:lsdException w:name="Grid Table 4 Accent 3" w:uiPriority="49"/>
-    <w:lsdException w:name="Grid Table 5 Dark Accent 3" w:uiPriority="50"/>
-    <w:lsdException w:name="Grid Table 6 Colorful Accent 3" w:uiPriority="51"/>
-    <w:lsdException w:name="Grid Table 7 Colorful Accent 3" w:uiPriority="52"/>
-    <w:lsdException w:name="Grid Table 1 Light Accent 4" w:uiPriority="46"/>
-    <w:lsdException w:name="Grid Table 2 Accent 4" w:uiPriority="47"/>
-    <w:lsdException w:name="Grid Table 3 Accent 4" w:uiPriority="48"/>
-    <w:lsdException w:name="Grid Table 4 Accent 4" w:uiPriority="49"/>
-    <w:lsdException w:name="Grid Table 5 Dark Accent 4" w:uiPriority="50"/>
-    <w:lsdException w:name="Grid Table 6 Colorful Accent 4" w:uiPriority="51"/>
-    <w:lsdException w:name="Grid Table 7 Colorful Accent 4" w:uiPriority="52"/>
-    <w:lsdException w:name="Grid Table 1 Light Accent 5" w:uiPriority="46"/>
-    <w:lsdException w:name="Grid Table 2 Accent 5" w:uiPriority="47"/>
-    <w:lsdException w:name="Grid Table 3 Accent 5" w:uiPriority="48"/>
-    <w:lsdException w:name="Grid Table 4 Accent 5" w:uiPriority="49"/>
-    <w:lsdException w:name="Grid Table 5 Dark Accent 5" w:uiPriority="50"/>
-    <w:lsdException w:name="Grid Table 6 Colorful Accent 5" w:uiPriority="51"/>
-    <w:lsdException w:name="Grid Table 7 Colorful Accent 5" w:uiPriority="52"/>
-    <w:lsdException w:name="Grid Table 1 Light Accent 6" w:uiPriority="46"/>
-    <w:lsdException w:name="Grid Table 2 Accent 6" w:uiPriority="47"/>
-    <w:lsdException w:name="Grid Table 3 Accent 6" w:uiPriority="48"/>
-    <w:lsdException w:name="Grid Table 4 Accent 6" w:uiPriority="49"/>
-    <w:lsdException w:name="Grid Table 5 Dark Accent 6" w:uiPriority="50"/>
-    <w:lsdException w:name="Grid Table 6 Colorful Accent 6" w:uiPriority="51"/>
-    <w:lsdException w:name="Grid Table 7 Colorful Accent 6" w:uiPriority="52"/>
-    <w:lsdException w:name="List Table 1 Light" w:uiPriority="46"/>
-    <w:lsdException w:name="List Table 2" w:uiPriority="47"/>
-    <w:lsdException w:name="List Table 3" w:uiPriority="48"/>
-    <w:lsdException w:name="List Table 4" w:uiPriority="49"/>
-    <w:lsdException w:name="List Table 5 Dark" w:uiPriority="50"/>
-    <w:lsdException w:name="List Table 6 Colorful" w:uiPriority="51"/>
-    <w:lsdException w:name="List Table 7 Colorful" w:uiPriority="52"/>
-    <w:lsdException w:name="List Table 1 Light Accent 1" w:uiPriority="46"/>
-    <w:lsdException w:name="List Table 2 Accent 1" w:uiPriority="47"/>
-    <w:lsdException w:name="List Table 3 Accent 1" w:uiPriority="48"/>
-    <w:lsdException w:name="List Table 4 Accent 1" w:uiPriority="49"/>
-    <w:lsdException w:name="List Table 5 Dark Accent 1" w:uiPriority="50"/>
-    <w:lsdException w:name="List Table 6 Colorful Accent 1" w:uiPriority="51"/>
-    <w:lsdException w:name="List Table 7 Colorful Accent 1" w:uiPriority="52"/>
-    <w:lsdException w:name="List Table 1 Light Accent 2" w:uiPriority="46"/>
-    <w:lsdException w:name="List Table 2 Accent 2" w:uiPriority="47"/>
-    <w:lsdException w:name="List Table 3 Accent 2" w:uiPriority="48"/>
-    <w:lsdException w:name="List Table 4 Accent 2" w:uiPriority="49"/>
-    <w:lsdException w:name="List Table 5 Dark Accent 2" w:uiPriority="50"/>
-    <w:lsdException w:name="List Table 6 Colorful Accent 2" w:uiPriority="51"/>
-    <w:lsdException w:name="List Table 7 Colorful Accent 2" w:uiPriority="52"/>
-    <w:lsdException w:name="List Table 1 Light Accent 3" w:uiPriority="46"/>
-    <w:lsdException w:name="List Table 2 Accent 3" w:uiPriority="47"/>
-    <w:lsdException w:name="List Table 3 Accent 3" w:uiPriority="48"/>
-    <w:lsdException w:name="List Table 4 Accent 3" w:uiPriority="49"/>
-    <w:lsdException w:name="List Table 5 Dark Accent 3" w:uiPriority="50"/>
-    <w:lsdException w:name="List Table 6 Colorful Accent 3" w:uiPriority="51"/>
-    <w:lsdException w:name="List Table 7 Colorful Accent 3" w:uiPriority="52"/>
-    <w:lsdException w:name="List Table 1 Light Accent 4" w:uiPriority="46"/>
-    <w:lsdException w:name="List Table 2 Accent 4" w:uiPriority="47"/>
-    <w:lsdException w:name="List Table 3 Accent 4" w:uiPriority="48"/>
-    <w:lsdException w:name="List Table 4 Accent 4" w:uiPriority="49"/>
-    <w:lsdException w:name="List Table 5 Dark Accent 4" w:uiPriority="50"/>
-    <w:lsdException w:name="List Table 6 Colorful Accent 4" w:uiPriority="51"/>
-    <w:lsdException w:name="List Table 7 Colorful Accent 4" w:uiPriority="52"/>
-    <w:lsdException w:name="List Table 1 Light Accent 5" w:uiPriority="46"/>
-    <w:lsdException w:name="List Table 2 Accent 5" w:uiPriority="47"/>
-    <w:lsdException w:name="List Table 3 Accent 5" w:uiPriority="48"/>
-    <w:lsdException w:name="List Table 4 Accent 5" w:uiPriority="49"/>
-    <w:lsdException w:name="List Table 5 Dark Accent 5" w:uiPriority="50"/>
-    <w:lsdException w:name="List Table 6 Colorful Accent 5" w:uiPriority="51"/>
-    <w:lsdException w:name="List Table 7 Colorful Accent 5" w:uiPriority="52"/>
-    <w:lsdException w:name="List Table 1 Light Accent 6" w:uiPriority="46"/>
-    <w:lsdException w:name="List Table 2 Accent 6" w:uiPriority="47"/>
-    <w:lsdException w:name="List Table 3 Accent 6" w:uiPriority="48"/>
-    <w:lsdException w:name="List Table 4 Accent 6" w:uiPriority="49"/>
-    <w:lsdException w:name="List Table 5 Dark Accent 6" w:uiPriority="50"/>
-    <w:lsdException w:name="List Table 6 Colorful Accent 6" w:uiPriority="51"/>
-    <w:lsdException w:name="List Table 7 Colorful Accent 6" w:uiPriority="52"/>
-    <w:lsdException w:name="Mention" w:semiHidden="1" w:unhideWhenUsed="1"/>
-    <w:lsdException w:name="Smart Hyperlink" w:semiHidden="1" w:unhideWhenUsed="1"/>
-    <w:lsdException w:name="Hashtag" w:semiHidden="1" w:unhideWhenUsed="1"/>
-    <w:lsdException w:name="Unresolved Mention" w:semiHidden="1" w:unhideWhenUsed="1"/>
-    <w:lsdException w:name="Smart Link" w:semiHidden="1" w:unhideWhenUsed="1"/>
-  </w:latentStyles>
-  <w:style w:type="paragraph" w:default="1" w:styleId="Normal">
-    <w:name w:val="Normal"/>
-    <w:qFormat/>
-  </w:style>
-  <w:style w:type="character" w:default="1" w:styleId="DefaultParagraphFont">
-    <w:name w:val="Default Paragraph Font"/>
-    <w:uiPriority w:val="1"/>
-    <w:semiHidden/>
-    <w:unhideWhenUsed/>
-  </w:style>
-  <w:style w:type="table" w:default="1" w:styleId="TableNormal">
-    <w:name w:val="Normal Table"/>
-    <w:uiPriority w:val="99"/>
-    <w:semiHidden/>
-    <w:unhideWhenUsed/>
-    <w:tblPr>
-      <w:tblInd w:w="0" w:type="dxa"/>
-      <w:tblCellMar>
-        <w:top w:w="0" w:type="dxa"/>
-        <w:left w:w="108" w:type="dxa"/>
-        <w:bottom w:w="0" w:type="dxa"/>
-        <w:right w:w="108" w:type="dxa"/>
-      </w:tblCellMar>
-    </w:tblPr>
-  </w:style>
-  <w:style w:type="numbering" w:default="1" w:styleId="NoList">
-    <w:name w:val="No List"/>
-    <w:uiPriority w:val="99"/>
-    <w:semiHidden/>
-    <w:unhideWhenUsed/>
-  </w:style>
-  <w:style w:type="paragraph" w:customStyle="1" w:styleId="D69C524081DC4A50BA1D2C0323DC05C5">
-    <w:name w:val="D69C524081DC4A50BA1D2C0323DC05C5"/>
-  </w:style>
-  <w:style w:type="paragraph" w:customStyle="1" w:styleId="FC130C55135447B280635A6764D0D0B8">
-    <w:name w:val="FC130C55135447B280635A6764D0D0B8"/>
-  </w:style>
-  <w:style w:type="paragraph" w:customStyle="1" w:styleId="CF2367E2F3EA4EC5AB99DFFBD344D016">
-    <w:name w:val="CF2367E2F3EA4EC5AB99DFFBD344D016"/>
-  </w:style>
-  <w:style w:type="paragraph" w:customStyle="1" w:styleId="4D288DBBE69B44429721919A8FFA3C7F">
-    <w:name w:val="4D288DBBE69B44429721919A8FFA3C7F"/>
-  </w:style>
-  <w:style w:type="paragraph" w:customStyle="1" w:styleId="0776D41946014DB9909BC7E7DD9B47C3">
-    <w:name w:val="0776D41946014DB9909BC7E7DD9B47C3"/>
-  </w:style>
-  <w:style w:type="paragraph" w:customStyle="1" w:styleId="23FE4DAA75D14E57A93D10560F680539">
-    <w:name w:val="23FE4DAA75D14E57A93D10560F680539"/>
-  </w:style>
-  <w:style w:type="paragraph" w:customStyle="1" w:styleId="115EBFCD566F43ECB348D4734ACF9F10">
-    <w:name w:val="115EBFCD566F43ECB348D4734ACF9F10"/>
-  </w:style>
-  <w:style w:type="paragraph" w:styleId="ListBullet">
-    <w:name w:val="List Bullet"/>
-    <w:basedOn w:val="Normal"/>
-    <w:uiPriority w:val="10"/>
-    <w:qFormat/>
-    <w:pPr>
-      <w:numPr>
-        <w:numId w:val="1"/>
-      </w:numPr>
-      <w:tabs>
-        <w:tab w:val="clear" w:pos="389"/>
-      </w:tabs>
-      <w:spacing w:after="120" w:line="312" w:lineRule="auto"/>
-      <w:ind w:left="0" w:firstLine="0"/>
-    </w:pPr>
-    <w:rPr>
-      <w:rFonts w:eastAsiaTheme="minorHAnsi"/>
-      <w:color w:val="0E2841" w:themeColor="text2"/>
-      <w:kern w:val="0"/>
-      <w:sz w:val="22"/>
-      <w:szCs w:val="22"/>
-      <w:lang w:eastAsia="ja-JP"/>
-      <w14:ligatures w14:val="none"/>
-    </w:rPr>
-  </w:style>
-  <w:style w:type="paragraph" w:customStyle="1" w:styleId="294AB72698214DF489AF3F209F8AA420">
-    <w:name w:val="294AB72698214DF489AF3F209F8AA420"/>
-  </w:style>
-  <w:style w:type="paragraph" w:customStyle="1" w:styleId="DDECD7DD2BC94E2CBCA1AD3BB721AB78">
-    <w:name w:val="DDECD7DD2BC94E2CBCA1AD3BB721AB78"/>
-  </w:style>
-  <w:style w:type="paragraph" w:customStyle="1" w:styleId="DDA8693A7B7F4F1AB0D8628B2F160063">
-    <w:name w:val="DDA8693A7B7F4F1AB0D8628B2F160063"/>
-  </w:style>
-  <w:style w:type="paragraph" w:customStyle="1" w:styleId="9D62095D440F4199865F048D939767C3">
-    <w:name w:val="9D62095D440F4199865F048D939767C3"/>
-  </w:style>
-  <w:style w:type="paragraph" w:customStyle="1" w:styleId="5EFB2936E802413DAC67226D730BACAA">
-    <w:name w:val="5EFB2936E802413DAC67226D730BACAA"/>
-  </w:style>
-  <w:style w:type="paragraph" w:customStyle="1" w:styleId="BF2F15D066EF4D22BC45AD6E471DD197">
-    <w:name w:val="BF2F15D066EF4D22BC45AD6E471DD197"/>
-  </w:style>
-  <w:style w:type="paragraph" w:customStyle="1" w:styleId="117656EA71324BBE949835F025856044">
-    <w:name w:val="117656EA71324BBE949835F025856044"/>
-  </w:style>
-  <w:style w:type="paragraph" w:customStyle="1" w:styleId="C8F3683977964609B981E96B428F0B80">
-    <w:name w:val="C8F3683977964609B981E96B428F0B80"/>
-  </w:style>
-  <w:style w:type="paragraph" w:customStyle="1" w:styleId="B4F6F261ADD8432DA6779A380F0E0E1A">
-    <w:name w:val="B4F6F261ADD8432DA6779A380F0E0E1A"/>
-  </w:style>
-  <w:style w:type="paragraph" w:customStyle="1" w:styleId="393E178417524ECA8C0C6BF77CCFC557">
-    <w:name w:val="393E178417524ECA8C0C6BF77CCFC557"/>
-  </w:style>
-  <w:style w:type="paragraph" w:customStyle="1" w:styleId="BE38CB2FC9FD4AFBA2675E9233B00575">
-    <w:name w:val="BE38CB2FC9FD4AFBA2675E9233B00575"/>
-  </w:style>
-  <w:style w:type="paragraph" w:customStyle="1" w:styleId="C5AE7C36D9124E9AB4A7130AF982DCC8">
-    <w:name w:val="C5AE7C36D9124E9AB4A7130AF982DCC8"/>
-  </w:style>
-</w:styles>
-</file>
-
-<file path=word/glossary/webSettings.xml><?xml version="1.0" encoding="utf-8"?>
-<w:webSettings xmlns:mc="http://schemas.openxmlformats.org/markup-compatibility/2006" xmlns:r="http://schemas.openxmlformats.org/officeDocument/2006/relationships" xmlns:w="http://schemas.openxmlformats.org/wordprocessingml/2006/main" xmlns:w14="http://schemas.microsoft.com/office/word/2010/wordml" xmlns:w15="http://schemas.microsoft.com/office/word/2012/wordml" xmlns:w16cex="http://schemas.microsoft.com/office/word/2018/wordml/cex" xmlns:w16cid="http://schemas.microsoft.com/office/word/2016/wordml/cid" xmlns:w16="http://schemas.microsoft.com/office/word/2018/wordml" xmlns:w16du="http://schemas.microsoft.com/office/word/2023/wordml/word16du" xmlns:w16sdtdh="http://schemas.microsoft.com/office/word/2020/wordml/sdtdatahash" xmlns:w16sdtfl="http://schemas.microsoft.com/office/word/2024/wordml/sdtformatlock" xmlns:w16se="http://schemas.microsoft.com/office/word/2015/wordml/symex" mc:Ignorable="w14 w15 w16se w16cid w16 w16cex w16sdtdh w16sdtfl w16du">
-  <w:optimizeForBrowser/>
-  <w:allowPNG/>
-</w:webSettings>
-</file>
-
 <file path=word/theme/theme1.xml><?xml version="1.0" encoding="utf-8"?>
 <a:theme xmlns:a="http://schemas.openxmlformats.org/drawingml/2006/main" name="Office Theme">
   <a:themeElements>

</xml_diff>

<commit_message>
Edited Day 4 homework
</commit_message>
<xml_diff>
--- a/Codes and Projects/Servicenow development/Day 4 Homework/Day 4 Homework.docx
+++ b/Codes and Projects/Servicenow development/Day 4 Homework/Day 4 Homework.docx
@@ -6,6 +6,7 @@
       <w:pPr>
         <w:pStyle w:val="Heading1"/>
         <w:spacing w:after="0" w:line="276" w:lineRule="auto"/>
+        <w:ind w:firstLine="720"/>
         <w:rPr>
           <w:sz w:val="96"/>
           <w:szCs w:val="28"/>
@@ -34,6 +35,9 @@
         <w:br/>
       </w:r>
       <w:r>
+        <w:rPr>
+          <w:noProof/>
+        </w:rPr>
         <w:drawing>
           <wp:inline distT="0" distB="0" distL="0" distR="0" wp14:anchorId="5A5D29F9" wp14:editId="6915CDAB">
             <wp:extent cx="6400800" cy="1149985"/>
@@ -82,6 +86,9 @@
         <w:br/>
       </w:r>
       <w:r>
+        <w:rPr>
+          <w:noProof/>
+        </w:rPr>
         <w:drawing>
           <wp:inline distT="0" distB="0" distL="0" distR="0" wp14:anchorId="28348104" wp14:editId="6EE792E0">
             <wp:extent cx="6400800" cy="1010285"/>
@@ -126,6 +133,9 @@
         <w:br/>
       </w:r>
       <w:r>
+        <w:rPr>
+          <w:noProof/>
+        </w:rPr>
         <w:drawing>
           <wp:inline distT="0" distB="0" distL="0" distR="0" wp14:anchorId="27F23ED2" wp14:editId="42EC74DE">
             <wp:extent cx="6400800" cy="1319530"/>
@@ -186,10 +196,13 @@
         <w:br/>
       </w:r>
       <w:r>
+        <w:rPr>
+          <w:noProof/>
+        </w:rPr>
         <w:drawing>
-          <wp:inline distT="0" distB="0" distL="0" distR="0" wp14:anchorId="2078D270" wp14:editId="69171E22">
-            <wp:extent cx="6400800" cy="3056890"/>
-            <wp:effectExtent l="0" t="0" r="0" b="0"/>
+          <wp:inline distT="0" distB="0" distL="0" distR="0" wp14:anchorId="2078D270" wp14:editId="00573C03">
+            <wp:extent cx="6495802" cy="3102261"/>
+            <wp:effectExtent l="0" t="0" r="635" b="3175"/>
             <wp:docPr id="1924644236" name="Picture 1"/>
             <wp:cNvGraphicFramePr>
               <a:graphicFrameLocks xmlns:a="http://schemas.openxmlformats.org/drawingml/2006/main" noChangeAspect="1"/>
@@ -210,7 +223,7 @@
                   <pic:spPr>
                     <a:xfrm>
                       <a:off x="0" y="0"/>
-                      <a:ext cx="6400800" cy="3056890"/>
+                      <a:ext cx="6507927" cy="3108052"/>
                     </a:xfrm>
                     <a:prstGeom prst="rect">
                       <a:avLst/>
@@ -225,6 +238,19 @@
     </w:p>
     <w:p>
       <w:pPr>
+        <w:rPr>
+          <w:rFonts w:eastAsiaTheme="minorEastAsia"/>
+          <w:iCs/>
+          <w:color w:val="3E3E3E" w:themeColor="text2" w:themeTint="E6"/>
+          <w:sz w:val="28"/>
+        </w:rPr>
+      </w:pPr>
+      <w:r>
+        <w:br w:type="page"/>
+      </w:r>
+    </w:p>
+    <w:p>
+      <w:pPr>
         <w:pStyle w:val="Heading2"/>
       </w:pPr>
       <w:r>
@@ -240,17 +266,25 @@
         <w:pStyle w:val="BlockText"/>
       </w:pPr>
       <w:r>
-        <w:t xml:space="preserve">Created a notification in a doctor table </w:t>
+        <w:t xml:space="preserve">Created a notification </w:t>
+      </w:r>
+      <w:proofErr w:type="gramStart"/>
+      <w:r>
+        <w:t>in</w:t>
+      </w:r>
+      <w:proofErr w:type="gramEnd"/>
+      <w:r>
+        <w:t xml:space="preserve"> a doctor table </w:t>
       </w:r>
       <w:r>
         <w:br/>
       </w:r>
       <w:r>
         <w:drawing>
-          <wp:inline distT="0" distB="0" distL="0" distR="0" wp14:anchorId="2B11B570" wp14:editId="795A614D">
-            <wp:extent cx="6400800" cy="913765"/>
-            <wp:effectExtent l="0" t="0" r="0" b="635"/>
-            <wp:docPr id="1045585677" name="Picture 1"/>
+          <wp:inline distT="0" distB="0" distL="0" distR="0" wp14:anchorId="4C3B09E3" wp14:editId="1400AC42">
+            <wp:extent cx="6400800" cy="887730"/>
+            <wp:effectExtent l="0" t="0" r="0" b="7620"/>
+            <wp:docPr id="1965850424" name="Picture 1"/>
             <wp:cNvGraphicFramePr>
               <a:graphicFrameLocks xmlns:a="http://schemas.openxmlformats.org/drawingml/2006/main" noChangeAspect="1"/>
             </wp:cNvGraphicFramePr>
@@ -258,7 +292,7 @@
               <a:graphicData uri="http://schemas.openxmlformats.org/drawingml/2006/picture">
                 <pic:pic xmlns:pic="http://schemas.openxmlformats.org/drawingml/2006/picture">
                   <pic:nvPicPr>
-                    <pic:cNvPr id="1045585677" name=""/>
+                    <pic:cNvPr id="1965850424" name=""/>
                     <pic:cNvPicPr/>
                   </pic:nvPicPr>
                   <pic:blipFill>
@@ -270,7 +304,7 @@
                   <pic:spPr>
                     <a:xfrm>
                       <a:off x="0" y="0"/>
-                      <a:ext cx="6400800" cy="913765"/>
+                      <a:ext cx="6400800" cy="887730"/>
                     </a:xfrm>
                     <a:prstGeom prst="rect">
                       <a:avLst/>
@@ -286,11 +320,14 @@
         <w:br/>
       </w:r>
       <w:r>
+        <w:br/>
+      </w:r>
+      <w:r>
         <w:drawing>
-          <wp:inline distT="0" distB="0" distL="0" distR="0" wp14:anchorId="6C60966D" wp14:editId="3B706C10">
-            <wp:extent cx="6082748" cy="5886024"/>
-            <wp:effectExtent l="0" t="0" r="0" b="635"/>
-            <wp:docPr id="604125665" name="Picture 1"/>
+          <wp:inline distT="0" distB="0" distL="0" distR="0" wp14:anchorId="213EAF26" wp14:editId="34F3ED53">
+            <wp:extent cx="5605153" cy="5625171"/>
+            <wp:effectExtent l="0" t="0" r="0" b="0"/>
+            <wp:docPr id="566030339" name="Picture 1"/>
             <wp:cNvGraphicFramePr>
               <a:graphicFrameLocks xmlns:a="http://schemas.openxmlformats.org/drawingml/2006/main" noChangeAspect="1"/>
             </wp:cNvGraphicFramePr>
@@ -298,7 +335,7 @@
               <a:graphicData uri="http://schemas.openxmlformats.org/drawingml/2006/picture">
                 <pic:pic xmlns:pic="http://schemas.openxmlformats.org/drawingml/2006/picture">
                   <pic:nvPicPr>
-                    <pic:cNvPr id="604125665" name=""/>
+                    <pic:cNvPr id="566030339" name=""/>
                     <pic:cNvPicPr/>
                   </pic:nvPicPr>
                   <pic:blipFill>
@@ -310,7 +347,7 @@
                   <pic:spPr>
                     <a:xfrm>
                       <a:off x="0" y="0"/>
-                      <a:ext cx="6133643" cy="5935273"/>
+                      <a:ext cx="5616676" cy="5636735"/>
                     </a:xfrm>
                     <a:prstGeom prst="rect">
                       <a:avLst/>
@@ -343,6 +380,9 @@
         <w:br/>
       </w:r>
       <w:r>
+        <w:rPr>
+          <w:noProof/>
+        </w:rPr>
         <w:drawing>
           <wp:inline distT="0" distB="0" distL="0" distR="0" wp14:anchorId="181F1923" wp14:editId="3AD987DF">
             <wp:extent cx="6400800" cy="1490980"/>
@@ -381,12 +421,23 @@
       </w:r>
       <w:r>
         <w:br/>
-        <w:t>Then created an import map between the two tables(doctor and doctor details import) then used the feature to map matching fields</w:t>
+        <w:t xml:space="preserve">Then created an import map between the two </w:t>
+      </w:r>
+      <w:proofErr w:type="gramStart"/>
+      <w:r>
+        <w:t>tables(</w:t>
+      </w:r>
+      <w:proofErr w:type="gramEnd"/>
+      <w:r>
+        <w:t>doctor and doctor details import) then used the feature to map matching fields</w:t>
       </w:r>
       <w:r>
         <w:br/>
       </w:r>
       <w:r>
+        <w:rPr>
+          <w:noProof/>
+        </w:rPr>
         <w:drawing>
           <wp:inline distT="0" distB="0" distL="0" distR="0" wp14:anchorId="1D30F67F" wp14:editId="0A6AA0E3">
             <wp:extent cx="6400800" cy="3497580"/>

</xml_diff>

<commit_message>
Downloaded slides and sources
</commit_message>
<xml_diff>
--- a/Codes and Projects/Servicenow development/Day 4 Homework/Day 4 Homework.docx
+++ b/Codes and Projects/Servicenow development/Day 4 Homework/Day 4 Homework.docx
@@ -6,7 +6,6 @@
       <w:pPr>
         <w:pStyle w:val="Heading1"/>
         <w:spacing w:after="0" w:line="276" w:lineRule="auto"/>
-        <w:ind w:firstLine="720"/>
         <w:rPr>
           <w:sz w:val="96"/>
           <w:szCs w:val="28"/>
@@ -280,6 +279,9 @@
         <w:br/>
       </w:r>
       <w:r>
+        <w:rPr>
+          <w:noProof/>
+        </w:rPr>
         <w:drawing>
           <wp:inline distT="0" distB="0" distL="0" distR="0" wp14:anchorId="4C3B09E3" wp14:editId="1400AC42">
             <wp:extent cx="6400800" cy="887730"/>
@@ -323,6 +325,9 @@
         <w:br/>
       </w:r>
       <w:r>
+        <w:rPr>
+          <w:noProof/>
+        </w:rPr>
         <w:drawing>
           <wp:inline distT="0" distB="0" distL="0" distR="0" wp14:anchorId="213EAF26" wp14:editId="34F3ED53">
             <wp:extent cx="5605153" cy="5625171"/>

</xml_diff>